<commit_message>
Update app logic and add Windows build workflow
</commit_message>
<xml_diff>
--- a/shablon.docx
+++ b/shablon.docx
@@ -5,15 +5,32 @@
     <w:p>
       <w:pPr>
         <w:pStyle w:val="Normal"/>
+        <w:tabs>
+          <w:tab w:val="clear" w:pos="708"/>
+          <w:tab w:val="left" w:pos="1085" w:leader="none"/>
+          <w:tab w:val="left" w:pos="2331" w:leader="none"/>
+          <w:tab w:val="left" w:pos="2435" w:leader="none"/>
+          <w:tab w:val="left" w:pos="2608" w:leader="none"/>
+        </w:tabs>
         <w:jc w:val="center"/>
-        <w:rPr>
-          <w:rFonts w:ascii="Times New Roman" w:hAnsi="Times New Roman" w:cs="Times New Roman"/>
-          <w:b/>
-          <w:bCs/>
-          <w:sz w:val="24"/>
-          <w:szCs w:val="24"/>
-        </w:rPr>
-      </w:pPr>
+        <w:rPr/>
+      </w:pPr>
+      <w:r>
+        <w:rPr>
+          <w:rFonts w:cs="Times New Roman" w:ascii="Times New Roman" w:hAnsi="Times New Roman"/>
+          <w:b/>
+          <w:bCs/>
+          <w:i w:val="false"/>
+          <w:caps w:val="false"/>
+          <w:smallCaps w:val="false"/>
+          <w:color w:val="000000"/>
+          <w:spacing w:val="0"/>
+          <w:sz w:val="24"/>
+          <w:szCs w:val="24"/>
+          <w:lang w:val="en-US"/>
+        </w:rPr>
+        <w:t xml:space="preserve">{% if show_xulosa %} </w:t>
+      </w:r>
       <w:r>
         <w:rPr>
           <w:rFonts w:cs="Times New Roman" w:ascii="Times New Roman" w:hAnsi="Times New Roman"/>
@@ -1681,7 +1698,7 @@
                 <w:szCs w:val="24"/>
                 <w:lang w:val="en-US" w:eastAsia="en-US" w:bidi="ar-SA"/>
               </w:rPr>
-              <w:t>Kichik muhandis: {{ fish }}__________</w:t>
+              <w:t>Kichik muhandis:{{ fish }}__________</w:t>
             </w:r>
           </w:p>
         </w:tc>
@@ -1820,18 +1837,7 @@
                 <w:szCs w:val="24"/>
                 <w:lang w:val="en-US" w:eastAsia="en-US" w:bidi="ar-SA"/>
               </w:rPr>
-              <w:t xml:space="preserve"> __________</w:t>
-            </w:r>
-            <w:r>
-              <w:rPr>
-                <w:rFonts w:eastAsia="Calibri" w:cs="Times New Roman" w:ascii="Times New Roman" w:hAnsi="Times New Roman"/>
-                <w:color w:val="000000"/>
-                <w:kern w:val="0"/>
-                <w:sz w:val="24"/>
-                <w:szCs w:val="24"/>
-                <w:lang w:val="en-US" w:eastAsia="en-US" w:bidi="ar-SA"/>
-              </w:rPr>
-              <w:t>_</w:t>
+              <w:t xml:space="preserve"> ___________</w:t>
             </w:r>
           </w:p>
           <w:p>
@@ -1879,18 +1885,7 @@
                 <w:szCs w:val="24"/>
                 <w:lang w:val="en-US" w:eastAsia="en-US" w:bidi="ar-SA"/>
               </w:rPr>
-              <w:t>shaxs</w:t>
-            </w:r>
-            <w:r>
-              <w:rPr>
-                <w:rFonts w:eastAsia="Calibri" w:cs="Times New Roman" w:ascii="Times New Roman" w:hAnsi="Times New Roman"/>
-                <w:color w:val="000000"/>
-                <w:kern w:val="0"/>
-                <w:sz w:val="24"/>
-                <w:szCs w:val="24"/>
-                <w:lang w:val="en-US" w:eastAsia="en-US" w:bidi="ar-SA"/>
-              </w:rPr>
-              <w:t xml:space="preserve">: </w:t>
+              <w:t xml:space="preserve">shaxs: </w:t>
             </w:r>
             <w:r>
               <w:rPr>
@@ -1917,18 +1912,7 @@
                 <w:szCs w:val="24"/>
                 <w:lang w:val="en-US" w:eastAsia="en-US" w:bidi="ar-SA"/>
               </w:rPr>
-              <w:t>________</w:t>
-            </w:r>
-            <w:r>
-              <w:rPr>
-                <w:rFonts w:eastAsia="Calibri" w:cs="Times New Roman" w:ascii="Times New Roman" w:hAnsi="Times New Roman"/>
-                <w:color w:val="000000"/>
-                <w:kern w:val="0"/>
-                <w:sz w:val="24"/>
-                <w:szCs w:val="24"/>
-                <w:lang w:val="en-US" w:eastAsia="en-US" w:bidi="ar-SA"/>
-              </w:rPr>
-              <w:t>_____</w:t>
+              <w:t>_____________</w:t>
             </w:r>
           </w:p>
         </w:tc>
@@ -1952,6 +1936,2583 @@
         <w:t>M. P.</w:t>
         <w:br/>
         <w:t>Sana: {{ inspection_date }}</w:t>
+      </w:r>
+    </w:p>
+    <w:p>
+      <w:pPr>
+        <w:pStyle w:val="Normal"/>
+        <w:spacing w:before="0" w:after="160"/>
+        <w:rPr>
+          <w:rFonts w:ascii="Times new roman" w:hAnsi="Times new roman"/>
+          <w:b/>
+          <w:bCs/>
+        </w:rPr>
+      </w:pPr>
+      <w:r>
+        <w:rPr>
+          <w:rFonts w:ascii="Times new roman" w:hAnsi="Times new roman"/>
+          <w:b/>
+          <w:bCs/>
+        </w:rPr>
+        <w:t>{% endif %}</w:t>
+      </w:r>
+      <w:r>
+        <w:br w:type="page"/>
+      </w:r>
+    </w:p>
+    <w:p>
+      <w:pPr>
+        <w:pStyle w:val="Normal"/>
+        <w:spacing w:lineRule="auto" w:line="240" w:before="0" w:after="0"/>
+        <w:jc w:val="center"/>
+        <w:rPr>
+          <w:rFonts w:ascii="Times New Roman" w:hAnsi="Times New Roman" w:cs="Times New Roman"/>
+          <w:b/>
+          <w:bCs/>
+          <w:sz w:val="24"/>
+          <w:szCs w:val="24"/>
+          <w:lang w:val="en-US"/>
+        </w:rPr>
+      </w:pPr>
+      <w:r>
+        <w:rPr>
+          <w:rFonts w:cs="Times New Roman" w:ascii="Times New Roman" w:hAnsi="Times New Roman"/>
+          <w:b/>
+          <w:bCs/>
+          <w:sz w:val="24"/>
+          <w:szCs w:val="24"/>
+          <w:lang w:val="en-US"/>
+        </w:rPr>
+        <w:t xml:space="preserve">{% if show_dalolatnoma %} Nuqson dalolatnomasi № </w:t>
+      </w:r>
+      <w:r>
+        <w:rPr>
+          <w:rFonts w:cs="Times New Roman" w:ascii="Times New Roman" w:hAnsi="Times New Roman"/>
+          <w:b/>
+          <w:bCs/>
+          <w:color w:val="000000"/>
+          <w:sz w:val="24"/>
+          <w:szCs w:val="24"/>
+          <w:lang w:val="en-US"/>
+        </w:rPr>
+        <w:t>{{num}}</w:t>
+      </w:r>
+    </w:p>
+    <w:p>
+      <w:pPr>
+        <w:pStyle w:val="Normal"/>
+        <w:spacing w:lineRule="auto" w:line="240" w:before="0" w:after="0"/>
+        <w:jc w:val="center"/>
+        <w:rPr>
+          <w:rFonts w:ascii="Times New Roman" w:hAnsi="Times New Roman" w:cs="Times New Roman"/>
+          <w:b/>
+          <w:bCs/>
+          <w:sz w:val="24"/>
+          <w:szCs w:val="24"/>
+          <w:lang w:val="en-US"/>
+        </w:rPr>
+      </w:pPr>
+      <w:r>
+        <w:rPr>
+          <w:rFonts w:cs="Times New Roman" w:ascii="Times New Roman" w:hAnsi="Times New Roman"/>
+          <w:b/>
+          <w:bCs/>
+          <w:sz w:val="24"/>
+          <w:szCs w:val="24"/>
+          <w:lang w:val="en-US"/>
+        </w:rPr>
+        <w:t>tibbiy asbob-uskunalari uchun</w:t>
+      </w:r>
+      <w:r>
+        <w:rPr>
+          <w:rFonts w:cs="Times New Roman" w:ascii="Times New Roman" w:hAnsi="Times New Roman"/>
+          <w:sz w:val="24"/>
+          <w:szCs w:val="24"/>
+          <w:lang w:val="en-US"/>
+        </w:rPr>
+        <w:br/>
+      </w:r>
+    </w:p>
+    <w:p>
+      <w:pPr>
+        <w:pStyle w:val="Normal"/>
+        <w:spacing w:lineRule="auto" w:line="240" w:before="0" w:after="0"/>
+        <w:jc w:val="both"/>
+        <w:rPr>
+          <w:rFonts w:ascii="Times New Roman" w:hAnsi="Times New Roman" w:cs="Times New Roman"/>
+          <w:color w:val="FF0000"/>
+          <w:sz w:val="24"/>
+          <w:szCs w:val="24"/>
+          <w:lang w:val="en-US"/>
+        </w:rPr>
+      </w:pPr>
+      <w:r>
+        <w:rPr>
+          <w:rFonts w:cs="Times New Roman" w:ascii="Times New Roman" w:hAnsi="Times New Roman"/>
+          <w:b/>
+          <w:bCs/>
+          <w:color w:val="000000"/>
+          <w:sz w:val="24"/>
+          <w:szCs w:val="24"/>
+          <w:lang w:val="en-US"/>
+        </w:rPr>
+        <w:t xml:space="preserve">{{ city }} </w:t>
+      </w:r>
+      <w:r>
+        <w:rPr>
+          <w:rFonts w:cs="Times New Roman" w:ascii="Times New Roman" w:hAnsi="Times New Roman"/>
+          <w:b/>
+          <w:bCs/>
+          <w:sz w:val="24"/>
+          <w:szCs w:val="24"/>
+          <w:lang w:val="en-US"/>
+        </w:rPr>
+        <w:t xml:space="preserve">                                                              </w:t>
+        <w:tab/>
+        <w:tab/>
+        <w:tab/>
+      </w:r>
+      <w:bookmarkStart w:id="0" w:name="_GoBack"/>
+      <w:r>
+        <w:rPr>
+          <w:rFonts w:cs="Times New Roman" w:ascii="Times New Roman" w:hAnsi="Times New Roman"/>
+          <w:b/>
+          <w:bCs/>
+          <w:color w:val="000000"/>
+          <w:sz w:val="24"/>
+          <w:szCs w:val="24"/>
+          <w:lang w:val="en-US"/>
+        </w:rPr>
+        <w:t>{{ inspection_date }}</w:t>
+      </w:r>
+      <w:bookmarkEnd w:id="0"/>
+    </w:p>
+    <w:p>
+      <w:pPr>
+        <w:pStyle w:val="Normal"/>
+        <w:rPr>
+          <w:rFonts w:ascii="Times New Roman" w:hAnsi="Times New Roman" w:cs="Times New Roman"/>
+          <w:b/>
+          <w:bCs/>
+          <w:sz w:val="24"/>
+          <w:szCs w:val="24"/>
+          <w:lang w:val="en-US"/>
+        </w:rPr>
+      </w:pPr>
+      <w:r>
+        <w:rPr>
+          <w:rFonts w:cs="Times New Roman" w:ascii="Times New Roman" w:hAnsi="Times New Roman"/>
+          <w:b/>
+          <w:bCs/>
+          <w:sz w:val="24"/>
+          <w:szCs w:val="24"/>
+          <w:lang w:val="en-US"/>
+        </w:rPr>
+      </w:r>
+    </w:p>
+    <w:p>
+      <w:pPr>
+        <w:pStyle w:val="Normal"/>
+        <w:tabs>
+          <w:tab w:val="clear" w:pos="708"/>
+          <w:tab w:val="left" w:pos="720" w:leader="none"/>
+        </w:tabs>
+        <w:rPr>
+          <w:rFonts w:ascii="Times New Roman" w:hAnsi="Times New Roman" w:cs="Times New Roman"/>
+          <w:b/>
+          <w:bCs/>
+          <w:sz w:val="24"/>
+          <w:szCs w:val="24"/>
+          <w:lang w:val="en-US"/>
+        </w:rPr>
+      </w:pPr>
+      <w:r>
+        <w:rPr>
+          <w:rFonts w:cs="Times New Roman" w:ascii="Times New Roman" w:hAnsi="Times New Roman"/>
+          <w:b/>
+          <w:bCs/>
+          <w:sz w:val="24"/>
+          <w:szCs w:val="24"/>
+          <w:lang w:val="en-US"/>
+        </w:rPr>
+        <w:t>1. Dalolatnoma tuzishning asosi:</w:t>
+      </w:r>
+    </w:p>
+    <w:p>
+      <w:pPr>
+        <w:pStyle w:val="Normal"/>
+        <w:tabs>
+          <w:tab w:val="clear" w:pos="708"/>
+          <w:tab w:val="left" w:pos="720" w:leader="none"/>
+        </w:tabs>
+        <w:rPr>
+          <w:rFonts w:ascii="Times New Roman" w:hAnsi="Times New Roman" w:cs="Times New Roman"/>
+          <w:sz w:val="24"/>
+          <w:szCs w:val="24"/>
+          <w:lang w:val="en-US"/>
+        </w:rPr>
+      </w:pPr>
+      <w:r>
+        <w:rPr>
+          <w:rFonts w:cs="Times New Roman" w:ascii="Times New Roman" w:hAnsi="Times New Roman"/>
+          <w:sz w:val="24"/>
+          <w:szCs w:val="24"/>
+          <w:lang w:val="en-US"/>
+        </w:rPr>
+        <w:t>(xizmat ko‘rsatish shartnomasi, buyurtma, rahbar buyrug‘i va hokazo)</w:t>
+      </w:r>
+    </w:p>
+    <w:p>
+      <w:pPr>
+        <w:pStyle w:val="HTMLPreformatted"/>
+        <w:shd w:val="clear" w:color="auto" w:fill="F8F9FA"/>
+        <w:spacing w:lineRule="atLeast" w:line="540"/>
+        <w:rPr>
+          <w:rFonts w:ascii="Times New Roman" w:hAnsi="Times New Roman" w:eastAsia="Calibri" w:cs="Times New Roman" w:eastAsiaTheme="minorHAnsi"/>
+          <w:b/>
+          <w:bCs/>
+          <w:sz w:val="24"/>
+          <w:szCs w:val="24"/>
+          <w:lang w:val="en-US" w:eastAsia="en-US"/>
+        </w:rPr>
+      </w:pPr>
+      <w:r>
+        <w:rPr>
+          <w:rFonts w:cs="Times New Roman" w:ascii="Times New Roman" w:hAnsi="Times New Roman"/>
+          <w:b/>
+          <w:bCs/>
+          <w:sz w:val="24"/>
+          <w:szCs w:val="24"/>
+          <w:lang w:val="en-US"/>
+        </w:rPr>
+        <w:t>2</w:t>
+      </w:r>
+      <w:r>
+        <w:rPr>
+          <w:rFonts w:eastAsia="Calibri" w:cs="Times New Roman" w:ascii="Times New Roman" w:hAnsi="Times New Roman" w:eastAsiaTheme="minorHAnsi"/>
+          <w:b/>
+          <w:bCs/>
+          <w:sz w:val="24"/>
+          <w:szCs w:val="24"/>
+          <w:lang w:val="en-US" w:eastAsia="en-US"/>
+        </w:rPr>
+        <w:t>. Tomonlar va tarkib: Tibbiy tashkiloting rahbari:</w:t>
+      </w:r>
+    </w:p>
+    <w:p>
+      <w:pPr>
+        <w:pStyle w:val="Normal"/>
+        <w:tabs>
+          <w:tab w:val="clear" w:pos="708"/>
+          <w:tab w:val="left" w:pos="720" w:leader="none"/>
+        </w:tabs>
+        <w:rPr>
+          <w:rFonts w:ascii="Times New Roman" w:hAnsi="Times New Roman" w:cs="Times New Roman"/>
+          <w:sz w:val="24"/>
+          <w:szCs w:val="24"/>
+          <w:lang w:val="en-US"/>
+        </w:rPr>
+      </w:pPr>
+      <w:r>
+        <w:rPr>
+          <w:rFonts w:cs="Times New Roman" w:ascii="Times New Roman" w:hAnsi="Times New Roman"/>
+          <w:sz w:val="24"/>
+          <w:szCs w:val="24"/>
+          <w:lang w:val="en-US"/>
+        </w:rPr>
+      </w:r>
+    </w:p>
+    <w:p>
+      <w:pPr>
+        <w:pStyle w:val="Normal"/>
+        <w:numPr>
+          <w:ilvl w:val="0"/>
+          <w:numId w:val="1"/>
+        </w:numPr>
+        <w:rPr>
+          <w:rFonts w:ascii="Times New Roman" w:hAnsi="Times New Roman" w:cs="Times New Roman"/>
+          <w:sz w:val="24"/>
+          <w:szCs w:val="24"/>
+          <w:lang w:val="en-US"/>
+        </w:rPr>
+      </w:pPr>
+      <w:r>
+        <w:rPr>
+          <w:rFonts w:cs="Times New Roman" w:ascii="Times New Roman" w:hAnsi="Times New Roman"/>
+          <w:sz w:val="24"/>
+          <w:szCs w:val="24"/>
+          <w:lang w:val="en-US"/>
+        </w:rPr>
+        <w:t xml:space="preserve">o F.I.Sh.: </w:t>
+      </w:r>
+      <w:r>
+        <w:rPr>
+          <w:rFonts w:cs="Times New Roman" w:ascii="Times New Roman" w:hAnsi="Times New Roman"/>
+          <w:b w:val="false"/>
+          <w:bCs w:val="false"/>
+          <w:color w:val="000000"/>
+          <w:sz w:val="24"/>
+          <w:szCs w:val="24"/>
+          <w:lang w:val="en-US"/>
+        </w:rPr>
+        <w:t xml:space="preserve">{{ org_head }} </w:t>
+      </w:r>
+    </w:p>
+    <w:p>
+      <w:pPr>
+        <w:pStyle w:val="Normal"/>
+        <w:numPr>
+          <w:ilvl w:val="0"/>
+          <w:numId w:val="1"/>
+        </w:numPr>
+        <w:rPr>
+          <w:rFonts w:ascii="Times New Roman" w:hAnsi="Times New Roman" w:cs="Times New Roman"/>
+          <w:sz w:val="24"/>
+          <w:szCs w:val="24"/>
+          <w:lang w:val="en-US"/>
+        </w:rPr>
+      </w:pPr>
+      <w:r>
+        <w:rPr>
+          <w:rFonts w:cs="Times New Roman" w:ascii="Times New Roman" w:hAnsi="Times New Roman"/>
+          <w:sz w:val="24"/>
+          <w:szCs w:val="24"/>
+          <w:lang w:val="en-US"/>
+        </w:rPr>
+        <w:t xml:space="preserve">o Lavozimi: </w:t>
+      </w:r>
+      <w:r>
+        <w:rPr>
+          <w:rFonts w:cs="Times New Roman" w:ascii="Times New Roman" w:hAnsi="Times New Roman"/>
+          <w:b w:val="false"/>
+          <w:bCs w:val="false"/>
+          <w:color w:val="000000"/>
+          <w:sz w:val="24"/>
+          <w:szCs w:val="24"/>
+          <w:lang w:val="en-US"/>
+        </w:rPr>
+        <w:t>{{ org_address }}</w:t>
+      </w:r>
+      <w:r>
+        <w:rPr>
+          <w:rFonts w:cs="Times New Roman" w:ascii="Times New Roman" w:hAnsi="Times New Roman"/>
+          <w:sz w:val="24"/>
+          <w:szCs w:val="24"/>
+          <w:lang w:val="en-US"/>
+        </w:rPr>
+        <w:t xml:space="preserve"> </w:t>
+      </w:r>
+      <w:r>
+        <w:rPr>
+          <w:rFonts w:cs="Times New Roman" w:ascii="Times New Roman" w:hAnsi="Times New Roman"/>
+          <w:b w:val="false"/>
+          <w:bCs w:val="false"/>
+          <w:color w:val="000000"/>
+          <w:sz w:val="24"/>
+          <w:szCs w:val="24"/>
+          <w:lang w:val="en-US"/>
+        </w:rPr>
+        <w:t>{{ org_head_lavozim }}</w:t>
+      </w:r>
+    </w:p>
+    <w:p>
+      <w:pPr>
+        <w:pStyle w:val="Normal"/>
+        <w:numPr>
+          <w:ilvl w:val="0"/>
+          <w:numId w:val="1"/>
+        </w:numPr>
+        <w:rPr>
+          <w:rFonts w:ascii="Times New Roman" w:hAnsi="Times New Roman" w:cs="Times New Roman"/>
+          <w:sz w:val="24"/>
+          <w:szCs w:val="24"/>
+          <w:lang w:val="en-US"/>
+        </w:rPr>
+      </w:pPr>
+      <w:r>
+        <w:rPr>
+          <w:rFonts w:cs="Times New Roman" w:ascii="Times New Roman" w:hAnsi="Times New Roman"/>
+          <w:sz w:val="24"/>
+          <w:szCs w:val="24"/>
+          <w:lang w:val="en-US"/>
+        </w:rPr>
+        <w:t>•</w:t>
+      </w:r>
+      <w:r>
+        <w:rPr>
+          <w:rFonts w:cs="Times New Roman" w:ascii="Times New Roman" w:hAnsi="Times New Roman"/>
+          <w:b/>
+          <w:bCs/>
+          <w:sz w:val="24"/>
+          <w:szCs w:val="24"/>
+          <w:lang w:val="en-US"/>
+        </w:rPr>
+        <w:t xml:space="preserve"> </w:t>
+      </w:r>
+      <w:r>
+        <w:rPr>
+          <w:rFonts w:cs="Times New Roman" w:ascii="Times New Roman" w:hAnsi="Times New Roman"/>
+          <w:b/>
+          <w:bCs/>
+          <w:sz w:val="24"/>
+          <w:szCs w:val="24"/>
+          <w:lang w:val="en-US"/>
+        </w:rPr>
+        <w:t>"Xaridlar markazi" davlat muassasasi mutaxassisi (jalb etilgan ekspert):</w:t>
+      </w:r>
+    </w:p>
+    <w:p>
+      <w:pPr>
+        <w:pStyle w:val="Normal"/>
+        <w:numPr>
+          <w:ilvl w:val="0"/>
+          <w:numId w:val="1"/>
+        </w:numPr>
+        <w:rPr>
+          <w:rFonts w:ascii="Times New Roman" w:hAnsi="Times New Roman" w:cs="Times New Roman"/>
+          <w:sz w:val="24"/>
+          <w:szCs w:val="24"/>
+          <w:lang w:val="en-US"/>
+        </w:rPr>
+      </w:pPr>
+      <w:r>
+        <w:rPr>
+          <w:rFonts w:cs="Times New Roman" w:ascii="Times New Roman" w:hAnsi="Times New Roman"/>
+          <w:sz w:val="24"/>
+          <w:szCs w:val="24"/>
+          <w:lang w:val="en-US"/>
+        </w:rPr>
+        <w:t xml:space="preserve">o Mutaxassisning F.I.Sh.: </w:t>
+      </w:r>
+      <w:r>
+        <w:rPr>
+          <w:rFonts w:cs="Times New Roman" w:ascii="Times New Roman" w:hAnsi="Times New Roman"/>
+          <w:color w:val="000000"/>
+          <w:sz w:val="24"/>
+          <w:szCs w:val="24"/>
+          <w:lang w:val="en-US"/>
+        </w:rPr>
+        <w:t>{{ fish }}</w:t>
+      </w:r>
+      <w:r>
+        <w:rPr>
+          <w:rFonts w:cs="Times New Roman" w:ascii="Times New Roman" w:hAnsi="Times New Roman"/>
+          <w:sz w:val="24"/>
+          <w:szCs w:val="24"/>
+          <w:lang w:val="en-US"/>
+        </w:rPr>
+        <w:t xml:space="preserve">    ___________</w:t>
+      </w:r>
+    </w:p>
+    <w:p>
+      <w:pPr>
+        <w:pStyle w:val="Normal"/>
+        <w:numPr>
+          <w:ilvl w:val="0"/>
+          <w:numId w:val="1"/>
+        </w:numPr>
+        <w:rPr>
+          <w:rFonts w:ascii="Times New Roman" w:hAnsi="Times New Roman" w:cs="Times New Roman"/>
+          <w:sz w:val="24"/>
+          <w:szCs w:val="24"/>
+          <w:lang w:val="en-US"/>
+        </w:rPr>
+      </w:pPr>
+      <w:r>
+        <w:rPr>
+          <w:rFonts w:cs="Times New Roman" w:ascii="Times New Roman" w:hAnsi="Times New Roman"/>
+          <w:sz w:val="24"/>
+          <w:szCs w:val="24"/>
+          <w:lang w:val="en-US"/>
+        </w:rPr>
+        <w:t xml:space="preserve">o Lavozimi/mutaxassisligi: </w:t>
+      </w:r>
+      <w:r>
+        <w:rPr>
+          <w:rFonts w:cs="Times New Roman" w:ascii="Times New Roman" w:hAnsi="Times New Roman"/>
+          <w:b w:val="false"/>
+          <w:bCs w:val="false"/>
+          <w:i w:val="false"/>
+          <w:caps w:val="false"/>
+          <w:smallCaps w:val="false"/>
+          <w:color w:val="000000"/>
+          <w:spacing w:val="0"/>
+          <w:sz w:val="24"/>
+          <w:szCs w:val="24"/>
+          <w:lang w:val="en-US"/>
+        </w:rPr>
+        <w:t>{{ lavozim }}</w:t>
+      </w:r>
+    </w:p>
+    <w:p>
+      <w:pPr>
+        <w:pStyle w:val="Normal"/>
+        <w:rPr>
+          <w:rFonts w:ascii="Times New Roman" w:hAnsi="Times New Roman" w:cs="Times New Roman"/>
+          <w:b/>
+          <w:bCs/>
+          <w:sz w:val="24"/>
+          <w:szCs w:val="24"/>
+          <w:lang w:val="en-US"/>
+        </w:rPr>
+      </w:pPr>
+      <w:r>
+        <w:rPr>
+          <w:rFonts w:cs="Times New Roman" w:ascii="Times New Roman" w:hAnsi="Times New Roman"/>
+          <w:b/>
+          <w:bCs/>
+          <w:sz w:val="24"/>
+          <w:szCs w:val="24"/>
+          <w:lang w:val="en-US"/>
+        </w:rPr>
+        <w:t xml:space="preserve">• </w:t>
+      </w:r>
+      <w:r>
+        <w:rPr>
+          <w:rFonts w:cs="Times New Roman" w:ascii="Times New Roman" w:hAnsi="Times New Roman"/>
+          <w:b/>
+          <w:bCs/>
+          <w:sz w:val="24"/>
+          <w:szCs w:val="24"/>
+          <w:lang w:val="en-US"/>
+        </w:rPr>
+        <w:t>Tibbiyot muassasasidagi uskunalar uchun mas’ul:</w:t>
+      </w:r>
+    </w:p>
+    <w:p>
+      <w:pPr>
+        <w:pStyle w:val="Normal"/>
+        <w:rPr>
+          <w:rFonts w:ascii="Times New Roman" w:hAnsi="Times New Roman" w:cs="Times New Roman"/>
+          <w:sz w:val="24"/>
+          <w:szCs w:val="24"/>
+          <w:lang w:val="en-US"/>
+        </w:rPr>
+      </w:pPr>
+      <w:r>
+        <w:rPr>
+          <w:rFonts w:cs="Times New Roman" w:ascii="Times New Roman" w:hAnsi="Times New Roman"/>
+          <w:sz w:val="24"/>
+          <w:szCs w:val="24"/>
+          <w:lang w:val="en-US"/>
+        </w:rPr>
+        <w:t xml:space="preserve">o F.I.O.: </w:t>
+      </w:r>
+      <w:r>
+        <w:rPr>
+          <w:rFonts w:eastAsia="Calibri" w:cs="Times New Roman" w:ascii="Times New Roman" w:hAnsi="Times New Roman"/>
+          <w:b w:val="false"/>
+          <w:i w:val="false"/>
+          <w:caps w:val="false"/>
+          <w:smallCaps w:val="false"/>
+          <w:color w:val="000000"/>
+          <w:spacing w:val="0"/>
+          <w:kern w:val="0"/>
+          <w:sz w:val="24"/>
+          <w:szCs w:val="24"/>
+          <w:lang w:val="en-US" w:eastAsia="en-US" w:bidi="ar-SA"/>
+        </w:rPr>
+        <w:t>{{ masul_shaxs }}</w:t>
+      </w:r>
+      <w:r>
+        <w:rPr>
+          <w:rFonts w:cs="Times New Roman" w:ascii="Times New Roman" w:hAnsi="Times New Roman"/>
+          <w:sz w:val="24"/>
+          <w:szCs w:val="24"/>
+          <w:lang w:val="en-US"/>
+        </w:rPr>
+        <w:t xml:space="preserve">  _____________</w:t>
+      </w:r>
+    </w:p>
+    <w:p>
+      <w:pPr>
+        <w:pStyle w:val="Normal"/>
+        <w:rPr>
+          <w:rFonts w:ascii="Times New Roman" w:hAnsi="Times New Roman" w:cs="Times New Roman"/>
+          <w:sz w:val="24"/>
+          <w:szCs w:val="24"/>
+          <w:lang w:val="en-US"/>
+        </w:rPr>
+      </w:pPr>
+      <w:r>
+        <w:rPr>
+          <w:rFonts w:cs="Times New Roman" w:ascii="Times New Roman" w:hAnsi="Times New Roman"/>
+          <w:sz w:val="24"/>
+          <w:szCs w:val="24"/>
+          <w:lang w:val="en-US"/>
+        </w:rPr>
+        <w:t xml:space="preserve">o Lavozimi: </w:t>
+      </w:r>
+      <w:r>
+        <w:rPr>
+          <w:rFonts w:eastAsia="Calibri" w:cs="Times New Roman" w:ascii="Times New Roman" w:hAnsi="Times New Roman"/>
+          <w:b w:val="false"/>
+          <w:i w:val="false"/>
+          <w:caps w:val="false"/>
+          <w:smallCaps w:val="false"/>
+          <w:color w:val="000000"/>
+          <w:spacing w:val="0"/>
+          <w:kern w:val="0"/>
+          <w:sz w:val="24"/>
+          <w:szCs w:val="24"/>
+          <w:lang w:val="en-US" w:eastAsia="en-US" w:bidi="ar-SA"/>
+        </w:rPr>
+        <w:t>{{ masul_shaxs_lavozim }}</w:t>
+      </w:r>
+    </w:p>
+    <w:p>
+      <w:pPr>
+        <w:pStyle w:val="Normal"/>
+        <w:rPr>
+          <w:rFonts w:ascii="Times New Roman" w:hAnsi="Times New Roman" w:cs="Times New Roman"/>
+          <w:b/>
+          <w:bCs/>
+          <w:sz w:val="24"/>
+          <w:szCs w:val="24"/>
+          <w:lang w:val="en-US"/>
+        </w:rPr>
+      </w:pPr>
+      <w:r>
+        <w:rPr>
+          <w:rFonts w:cs="Times New Roman" w:ascii="Times New Roman" w:hAnsi="Times New Roman"/>
+          <w:b/>
+          <w:bCs/>
+          <w:sz w:val="24"/>
+          <w:szCs w:val="24"/>
+          <w:lang w:val="en-US"/>
+        </w:rPr>
+        <w:t>3.Uskuna haqida ma’lumot:</w:t>
+      </w:r>
+    </w:p>
+    <w:tbl>
+      <w:tblPr>
+        <w:tblStyle w:val="a3"/>
+        <w:tblW w:w="9345" w:type="dxa"/>
+        <w:jc w:val="left"/>
+        <w:tblInd w:w="0" w:type="dxa"/>
+        <w:tblLayout w:type="fixed"/>
+        <w:tblCellMar>
+          <w:top w:w="0" w:type="dxa"/>
+          <w:left w:w="108" w:type="dxa"/>
+          <w:bottom w:w="0" w:type="dxa"/>
+          <w:right w:w="108" w:type="dxa"/>
+        </w:tblCellMar>
+        <w:tblLook w:val="04a0" w:noHBand="0" w:noVBand="1" w:firstColumn="1" w:lastRow="0" w:lastColumn="0" w:firstRow="1"/>
+      </w:tblPr>
+      <w:tblGrid>
+        <w:gridCol w:w="4672"/>
+        <w:gridCol w:w="4672"/>
+      </w:tblGrid>
+      <w:tr>
+        <w:trPr/>
+        <w:tc>
+          <w:tcPr>
+            <w:tcW w:w="4672" w:type="dxa"/>
+            <w:tcBorders/>
+          </w:tcPr>
+          <w:p>
+            <w:pPr>
+              <w:pStyle w:val="Normal"/>
+              <w:widowControl/>
+              <w:suppressAutoHyphens w:val="true"/>
+              <w:spacing w:lineRule="auto" w:line="240" w:before="0" w:after="0"/>
+              <w:jc w:val="left"/>
+              <w:rPr>
+                <w:rFonts w:ascii="Times New Roman" w:hAnsi="Times New Roman" w:cs="Times New Roman"/>
+                <w:sz w:val="24"/>
+                <w:szCs w:val="24"/>
+              </w:rPr>
+            </w:pPr>
+            <w:r>
+              <w:rPr>
+                <w:rFonts w:eastAsia="Calibri" w:cs="Times New Roman" w:ascii="Times New Roman" w:hAnsi="Times New Roman"/>
+                <w:kern w:val="0"/>
+                <w:sz w:val="24"/>
+                <w:szCs w:val="24"/>
+                <w:lang w:val="ru-RU" w:eastAsia="en-US" w:bidi="ar-SA"/>
+              </w:rPr>
+              <w:t>Nomi:</w:t>
+            </w:r>
+          </w:p>
+        </w:tc>
+        <w:tc>
+          <w:tcPr>
+            <w:tcW w:w="4672" w:type="dxa"/>
+            <w:tcBorders/>
+          </w:tcPr>
+          <w:p>
+            <w:pPr>
+              <w:pStyle w:val="Normal"/>
+              <w:suppressAutoHyphens w:val="true"/>
+              <w:spacing w:lineRule="auto" w:line="240" w:before="0" w:after="0"/>
+              <w:rPr>
+                <w:rFonts w:ascii="Times New Roman" w:hAnsi="Times New Roman" w:cs="Times New Roman"/>
+                <w:bCs/>
+                <w:sz w:val="24"/>
+                <w:szCs w:val="24"/>
+                <w:lang w:val="en-US"/>
+              </w:rPr>
+            </w:pPr>
+            <w:r>
+              <w:rPr>
+                <w:rFonts w:cs="Times New Roman" w:ascii="Times New Roman" w:hAnsi="Times New Roman"/>
+                <w:b w:val="false"/>
+                <w:bCs w:val="false"/>
+                <w:color w:val="000000"/>
+                <w:sz w:val="24"/>
+                <w:szCs w:val="24"/>
+                <w:lang w:val="en-US"/>
+              </w:rPr>
+              <w:t>{{ equipment_name }}</w:t>
+            </w:r>
+          </w:p>
+        </w:tc>
+      </w:tr>
+      <w:tr>
+        <w:trPr/>
+        <w:tc>
+          <w:tcPr>
+            <w:tcW w:w="4672" w:type="dxa"/>
+            <w:tcBorders/>
+          </w:tcPr>
+          <w:p>
+            <w:pPr>
+              <w:pStyle w:val="Normal"/>
+              <w:widowControl/>
+              <w:suppressAutoHyphens w:val="true"/>
+              <w:spacing w:lineRule="auto" w:line="240" w:before="0" w:after="0"/>
+              <w:jc w:val="left"/>
+              <w:rPr>
+                <w:rFonts w:ascii="Times New Roman" w:hAnsi="Times New Roman" w:cs="Times New Roman"/>
+                <w:sz w:val="24"/>
+                <w:szCs w:val="24"/>
+              </w:rPr>
+            </w:pPr>
+            <w:r>
+              <w:rPr>
+                <w:rFonts w:eastAsia="Calibri" w:cs="Times New Roman" w:ascii="Times New Roman" w:hAnsi="Times New Roman"/>
+                <w:kern w:val="0"/>
+                <w:sz w:val="24"/>
+                <w:szCs w:val="24"/>
+                <w:lang w:val="ru-RU" w:eastAsia="en-US" w:bidi="ar-SA"/>
+              </w:rPr>
+              <w:t>Model:</w:t>
+            </w:r>
+          </w:p>
+        </w:tc>
+        <w:tc>
+          <w:tcPr>
+            <w:tcW w:w="4672" w:type="dxa"/>
+            <w:tcBorders/>
+          </w:tcPr>
+          <w:p>
+            <w:pPr>
+              <w:pStyle w:val="Normal"/>
+              <w:suppressAutoHyphens w:val="true"/>
+              <w:spacing w:lineRule="auto" w:line="240" w:before="0" w:after="0"/>
+              <w:rPr>
+                <w:rFonts w:ascii="Times New Roman" w:hAnsi="Times New Roman" w:cs="Times New Roman"/>
+                <w:b/>
+                <w:bCs/>
+                <w:sz w:val="24"/>
+                <w:szCs w:val="24"/>
+                <w:lang w:val="en-US"/>
+              </w:rPr>
+            </w:pPr>
+            <w:r>
+              <w:rPr>
+                <w:rFonts w:cs="Times New Roman" w:ascii="Times New Roman" w:hAnsi="Times New Roman"/>
+                <w:b w:val="false"/>
+                <w:bCs w:val="false"/>
+                <w:color w:val="000000"/>
+                <w:sz w:val="24"/>
+                <w:szCs w:val="24"/>
+                <w:lang w:val="en-US"/>
+              </w:rPr>
+              <w:t>{{ equipment_model }}</w:t>
+            </w:r>
+          </w:p>
+        </w:tc>
+      </w:tr>
+      <w:tr>
+        <w:trPr/>
+        <w:tc>
+          <w:tcPr>
+            <w:tcW w:w="4672" w:type="dxa"/>
+            <w:tcBorders/>
+          </w:tcPr>
+          <w:p>
+            <w:pPr>
+              <w:pStyle w:val="Normal"/>
+              <w:widowControl/>
+              <w:suppressAutoHyphens w:val="true"/>
+              <w:spacing w:lineRule="auto" w:line="240" w:before="0" w:after="0"/>
+              <w:jc w:val="left"/>
+              <w:rPr>
+                <w:rFonts w:ascii="Times New Roman" w:hAnsi="Times New Roman" w:cs="Times New Roman"/>
+                <w:sz w:val="24"/>
+                <w:szCs w:val="24"/>
+              </w:rPr>
+            </w:pPr>
+            <w:r>
+              <w:rPr>
+                <w:rFonts w:eastAsia="Calibri" w:cs="Times New Roman" w:ascii="Times New Roman" w:hAnsi="Times New Roman"/>
+                <w:kern w:val="0"/>
+                <w:sz w:val="24"/>
+                <w:szCs w:val="24"/>
+                <w:lang w:val="ru-RU" w:eastAsia="en-US" w:bidi="ar-SA"/>
+              </w:rPr>
+              <w:t>Zavod raqami:</w:t>
+            </w:r>
+          </w:p>
+        </w:tc>
+        <w:tc>
+          <w:tcPr>
+            <w:tcW w:w="4672" w:type="dxa"/>
+            <w:tcBorders/>
+          </w:tcPr>
+          <w:p>
+            <w:pPr>
+              <w:pStyle w:val="Normal"/>
+              <w:suppressAutoHyphens w:val="true"/>
+              <w:spacing w:lineRule="auto" w:line="240" w:before="0" w:after="0"/>
+              <w:rPr>
+                <w:rFonts w:ascii="Times New Roman" w:hAnsi="Times New Roman" w:cs="Times New Roman"/>
+                <w:b/>
+                <w:bCs/>
+                <w:sz w:val="24"/>
+                <w:szCs w:val="24"/>
+                <w:lang w:val="en-US"/>
+              </w:rPr>
+            </w:pPr>
+            <w:r>
+              <w:rPr>
+                <w:rFonts w:cs="Times New Roman" w:ascii="Times New Roman" w:hAnsi="Times New Roman"/>
+                <w:b w:val="false"/>
+                <w:bCs w:val="false"/>
+                <w:color w:val="000000"/>
+                <w:sz w:val="24"/>
+                <w:szCs w:val="24"/>
+                <w:lang w:val="en-US"/>
+              </w:rPr>
+              <w:t>{{ factory_number }}</w:t>
+            </w:r>
+          </w:p>
+        </w:tc>
+      </w:tr>
+      <w:tr>
+        <w:trPr/>
+        <w:tc>
+          <w:tcPr>
+            <w:tcW w:w="4672" w:type="dxa"/>
+            <w:tcBorders/>
+          </w:tcPr>
+          <w:p>
+            <w:pPr>
+              <w:pStyle w:val="Normal"/>
+              <w:widowControl/>
+              <w:suppressAutoHyphens w:val="true"/>
+              <w:spacing w:lineRule="auto" w:line="240" w:before="0" w:after="0"/>
+              <w:jc w:val="left"/>
+              <w:rPr>
+                <w:rFonts w:ascii="Times New Roman" w:hAnsi="Times New Roman" w:cs="Times New Roman"/>
+                <w:sz w:val="24"/>
+                <w:szCs w:val="24"/>
+              </w:rPr>
+            </w:pPr>
+            <w:r>
+              <w:rPr>
+                <w:rFonts w:eastAsia="Calibri" w:cs="Times New Roman" w:ascii="Times New Roman" w:hAnsi="Times New Roman"/>
+                <w:kern w:val="0"/>
+                <w:sz w:val="24"/>
+                <w:szCs w:val="24"/>
+                <w:lang w:val="ru-RU" w:eastAsia="en-US" w:bidi="ar-SA"/>
+              </w:rPr>
+              <w:t>Ishlab chiqaruvchi:</w:t>
+            </w:r>
+          </w:p>
+        </w:tc>
+        <w:tc>
+          <w:tcPr>
+            <w:tcW w:w="4672" w:type="dxa"/>
+            <w:tcBorders/>
+          </w:tcPr>
+          <w:p>
+            <w:pPr>
+              <w:pStyle w:val="Normal"/>
+              <w:suppressAutoHyphens w:val="true"/>
+              <w:spacing w:lineRule="auto" w:line="240" w:before="0" w:after="0"/>
+              <w:rPr>
+                <w:rFonts w:ascii="Times New Roman" w:hAnsi="Times New Roman" w:cs="Times New Roman"/>
+                <w:b/>
+                <w:bCs/>
+                <w:sz w:val="24"/>
+                <w:szCs w:val="24"/>
+                <w:lang w:val="en-US"/>
+              </w:rPr>
+            </w:pPr>
+            <w:r>
+              <w:rPr>
+                <w:rFonts w:cs="Times New Roman" w:ascii="Times New Roman" w:hAnsi="Times New Roman"/>
+                <w:b w:val="false"/>
+                <w:bCs w:val="false"/>
+                <w:color w:val="000000"/>
+                <w:sz w:val="24"/>
+                <w:szCs w:val="24"/>
+                <w:lang w:val="en-US"/>
+              </w:rPr>
+              <w:t>{{region_manufactured}}</w:t>
+            </w:r>
+          </w:p>
+        </w:tc>
+      </w:tr>
+      <w:tr>
+        <w:trPr/>
+        <w:tc>
+          <w:tcPr>
+            <w:tcW w:w="4672" w:type="dxa"/>
+            <w:tcBorders/>
+          </w:tcPr>
+          <w:p>
+            <w:pPr>
+              <w:pStyle w:val="Normal"/>
+              <w:widowControl/>
+              <w:suppressAutoHyphens w:val="true"/>
+              <w:spacing w:lineRule="auto" w:line="240" w:before="0" w:after="0"/>
+              <w:jc w:val="left"/>
+              <w:rPr>
+                <w:rFonts w:ascii="Times New Roman" w:hAnsi="Times New Roman" w:cs="Times New Roman"/>
+                <w:sz w:val="24"/>
+                <w:szCs w:val="24"/>
+              </w:rPr>
+            </w:pPr>
+            <w:r>
+              <w:rPr>
+                <w:rFonts w:eastAsia="Calibri" w:cs="Times New Roman" w:ascii="Times New Roman" w:hAnsi="Times New Roman"/>
+                <w:kern w:val="0"/>
+                <w:sz w:val="24"/>
+                <w:szCs w:val="24"/>
+                <w:lang w:val="ru-RU" w:eastAsia="en-US" w:bidi="ar-SA"/>
+              </w:rPr>
+              <w:t>Inventar raqami:</w:t>
+            </w:r>
+          </w:p>
+        </w:tc>
+        <w:tc>
+          <w:tcPr>
+            <w:tcW w:w="4672" w:type="dxa"/>
+            <w:tcBorders/>
+          </w:tcPr>
+          <w:p>
+            <w:pPr>
+              <w:pStyle w:val="Normal"/>
+              <w:suppressAutoHyphens w:val="true"/>
+              <w:spacing w:lineRule="auto" w:line="240" w:before="0" w:after="0"/>
+              <w:rPr>
+                <w:rFonts w:ascii="Times New Roman" w:hAnsi="Times New Roman" w:cs="Times New Roman"/>
+                <w:sz w:val="24"/>
+                <w:szCs w:val="24"/>
+                <w:lang w:val="en-US"/>
+              </w:rPr>
+            </w:pPr>
+            <w:r>
+              <w:rPr>
+                <w:rFonts w:cs="Times New Roman" w:ascii="Times New Roman" w:hAnsi="Times New Roman"/>
+                <w:b w:val="false"/>
+                <w:bCs w:val="false"/>
+                <w:color w:val="000000"/>
+                <w:sz w:val="24"/>
+                <w:szCs w:val="24"/>
+                <w:shd w:fill="FFFFFF" w:val="clear"/>
+                <w:lang w:val="en-US"/>
+              </w:rPr>
+              <w:t>{{ inventory_number }}</w:t>
+            </w:r>
+          </w:p>
+        </w:tc>
+      </w:tr>
+      <w:tr>
+        <w:trPr/>
+        <w:tc>
+          <w:tcPr>
+            <w:tcW w:w="4672" w:type="dxa"/>
+            <w:tcBorders/>
+          </w:tcPr>
+          <w:p>
+            <w:pPr>
+              <w:pStyle w:val="Normal"/>
+              <w:widowControl/>
+              <w:suppressAutoHyphens w:val="true"/>
+              <w:spacing w:lineRule="auto" w:line="240" w:before="0" w:after="0"/>
+              <w:jc w:val="left"/>
+              <w:rPr>
+                <w:rFonts w:ascii="Times New Roman" w:hAnsi="Times New Roman" w:cs="Times New Roman"/>
+                <w:sz w:val="24"/>
+                <w:szCs w:val="24"/>
+              </w:rPr>
+            </w:pPr>
+            <w:r>
+              <w:rPr>
+                <w:rFonts w:eastAsia="Calibri" w:cs="Times New Roman" w:ascii="Times New Roman" w:hAnsi="Times New Roman"/>
+                <w:kern w:val="0"/>
+                <w:sz w:val="24"/>
+                <w:szCs w:val="24"/>
+                <w:lang w:val="ru-RU" w:eastAsia="en-US" w:bidi="ar-SA"/>
+              </w:rPr>
+              <w:t>Ishga tushirilgan sana:</w:t>
+            </w:r>
+          </w:p>
+        </w:tc>
+        <w:tc>
+          <w:tcPr>
+            <w:tcW w:w="4672" w:type="dxa"/>
+            <w:tcBorders/>
+          </w:tcPr>
+          <w:p>
+            <w:pPr>
+              <w:pStyle w:val="Normal"/>
+              <w:suppressAutoHyphens w:val="true"/>
+              <w:spacing w:lineRule="auto" w:line="240" w:before="0" w:after="0"/>
+              <w:rPr>
+                <w:rFonts w:ascii="Times New Roman" w:hAnsi="Times New Roman" w:cs="Times New Roman"/>
+                <w:b/>
+                <w:bCs/>
+                <w:sz w:val="24"/>
+                <w:szCs w:val="24"/>
+                <w:lang w:val="en-US"/>
+              </w:rPr>
+            </w:pPr>
+            <w:r>
+              <w:rPr>
+                <w:rFonts w:cs="Times New Roman" w:ascii="Times New Roman" w:hAnsi="Times New Roman"/>
+                <w:b w:val="false"/>
+                <w:bCs w:val="false"/>
+                <w:color w:val="000000"/>
+                <w:sz w:val="24"/>
+                <w:szCs w:val="24"/>
+                <w:lang w:val="en-US"/>
+              </w:rPr>
+              <w:t>{{year_manufactured}}</w:t>
+            </w:r>
+          </w:p>
+        </w:tc>
+      </w:tr>
+      <w:tr>
+        <w:trPr/>
+        <w:tc>
+          <w:tcPr>
+            <w:tcW w:w="4672" w:type="dxa"/>
+            <w:tcBorders/>
+          </w:tcPr>
+          <w:p>
+            <w:pPr>
+              <w:pStyle w:val="Normal"/>
+              <w:widowControl/>
+              <w:suppressAutoHyphens w:val="true"/>
+              <w:spacing w:lineRule="auto" w:line="240" w:before="0" w:after="0"/>
+              <w:jc w:val="left"/>
+              <w:rPr>
+                <w:rFonts w:ascii="Times New Roman" w:hAnsi="Times New Roman" w:cs="Times New Roman"/>
+                <w:sz w:val="24"/>
+                <w:szCs w:val="24"/>
+                <w:lang w:val="en-US"/>
+              </w:rPr>
+            </w:pPr>
+            <w:r>
+              <w:rPr>
+                <w:rFonts w:eastAsia="Calibri" w:cs="Times New Roman" w:ascii="Times New Roman" w:hAnsi="Times New Roman"/>
+                <w:kern w:val="0"/>
+                <w:sz w:val="24"/>
+                <w:szCs w:val="24"/>
+                <w:lang w:val="en-US" w:eastAsia="en-US" w:bidi="ar-SA"/>
+              </w:rPr>
+              <w:t>Kafolat muddati: (amal qilmoqda/tugagan)</w:t>
+            </w:r>
+          </w:p>
+        </w:tc>
+        <w:tc>
+          <w:tcPr>
+            <w:tcW w:w="4672" w:type="dxa"/>
+            <w:tcBorders/>
+          </w:tcPr>
+          <w:p>
+            <w:pPr>
+              <w:pStyle w:val="Normal"/>
+              <w:widowControl/>
+              <w:suppressAutoHyphens w:val="true"/>
+              <w:spacing w:lineRule="auto" w:line="240" w:before="0" w:after="0"/>
+              <w:jc w:val="left"/>
+              <w:rPr>
+                <w:rFonts w:ascii="Times New Roman" w:hAnsi="Times New Roman" w:cs="Times New Roman"/>
+                <w:sz w:val="24"/>
+                <w:szCs w:val="24"/>
+                <w:lang w:val="en-US"/>
+              </w:rPr>
+            </w:pPr>
+            <w:r>
+              <w:rPr>
+                <w:rFonts w:eastAsia="Calibri" w:cs="Times New Roman" w:ascii="Times New Roman" w:hAnsi="Times New Roman"/>
+                <w:kern w:val="0"/>
+                <w:sz w:val="24"/>
+                <w:szCs w:val="24"/>
+                <w:lang w:val="en-US" w:eastAsia="en-US" w:bidi="ar-SA"/>
+              </w:rPr>
+              <w:t>{{ kafolat }}</w:t>
+            </w:r>
+          </w:p>
+        </w:tc>
+      </w:tr>
+    </w:tbl>
+    <w:p>
+      <w:pPr>
+        <w:pStyle w:val="Normal"/>
+        <w:rPr>
+          <w:rFonts w:ascii="Times New Roman" w:hAnsi="Times New Roman" w:cs="Times New Roman"/>
+          <w:b/>
+          <w:bCs/>
+          <w:sz w:val="24"/>
+          <w:szCs w:val="24"/>
+          <w:lang w:val="en-US"/>
+        </w:rPr>
+      </w:pPr>
+      <w:r>
+        <w:rPr>
+          <w:rFonts w:cs="Times New Roman" w:ascii="Times New Roman" w:hAnsi="Times New Roman"/>
+          <w:b/>
+          <w:bCs/>
+          <w:sz w:val="24"/>
+          <w:szCs w:val="24"/>
+          <w:lang w:val="en-US"/>
+        </w:rPr>
+      </w:r>
+    </w:p>
+    <w:p>
+      <w:pPr>
+        <w:pStyle w:val="Normal"/>
+        <w:rPr>
+          <w:rFonts w:ascii="Times New Roman" w:hAnsi="Times New Roman" w:cs="Times New Roman"/>
+          <w:b/>
+          <w:bCs/>
+          <w:sz w:val="24"/>
+          <w:szCs w:val="24"/>
+          <w:lang w:val="en-US"/>
+        </w:rPr>
+      </w:pPr>
+      <w:r>
+        <w:rPr>
+          <w:rFonts w:cs="Times New Roman" w:ascii="Times New Roman" w:hAnsi="Times New Roman"/>
+          <w:b/>
+          <w:bCs/>
+          <w:sz w:val="24"/>
+          <w:szCs w:val="24"/>
+          <w:lang w:val="en-US"/>
+        </w:rPr>
+        <w:t>4. Aniqlangan nuqsonlar</w:t>
+      </w:r>
+    </w:p>
+    <w:p>
+      <w:pPr>
+        <w:pStyle w:val="Normal"/>
+        <w:spacing w:lineRule="auto" w:line="240" w:before="0" w:after="0"/>
+        <w:rPr>
+          <w:rFonts w:ascii="Times New Roman" w:hAnsi="Times New Roman" w:cs="Times New Roman"/>
+          <w:sz w:val="24"/>
+          <w:szCs w:val="24"/>
+          <w:lang w:val="en-US"/>
+        </w:rPr>
+      </w:pPr>
+      <w:r>
+        <w:rPr>
+          <w:rFonts w:cs="Times New Roman" w:ascii="Times New Roman" w:hAnsi="Times New Roman"/>
+          <w:sz w:val="24"/>
+          <w:szCs w:val="24"/>
+          <w:lang w:val="en-US"/>
+        </w:rPr>
+        <w:t>(nosozliklarning batafsil tavsifi, diagnostika natijalari)</w:t>
+      </w:r>
+    </w:p>
+    <w:p>
+      <w:pPr>
+        <w:pStyle w:val="Normal"/>
+        <w:spacing w:lineRule="auto" w:line="240" w:before="0" w:after="0"/>
+        <w:rPr>
+          <w:rFonts w:ascii="Times New Roman" w:hAnsi="Times New Roman" w:cs="Times New Roman"/>
+          <w:b/>
+          <w:bCs/>
+          <w:sz w:val="24"/>
+          <w:szCs w:val="24"/>
+          <w:lang w:val="en-US"/>
+        </w:rPr>
+      </w:pPr>
+      <w:r>
+        <w:rPr>
+          <w:rFonts w:cs="Times New Roman" w:ascii="Times New Roman" w:hAnsi="Times New Roman"/>
+          <w:b/>
+          <w:bCs/>
+          <w:sz w:val="24"/>
+          <w:szCs w:val="24"/>
+          <w:lang w:val="en-US"/>
+        </w:rPr>
+        <w:t>№</w:t>
+      </w:r>
+      <w:r>
+        <w:rPr>
+          <w:rFonts w:cs="Times New Roman" w:ascii="Times New Roman" w:hAnsi="Times New Roman"/>
+          <w:b/>
+          <w:bCs/>
+          <w:sz w:val="24"/>
+          <w:szCs w:val="24"/>
+          <w:lang w:val="en-US"/>
+        </w:rPr>
+        <w:tab/>
+        <w:t>Nuqson tavsifi</w:t>
+        <w:tab/>
+        <w:t xml:space="preserve">     Ehtimoliy sababi</w:t>
+        <w:tab/>
+        <w:t xml:space="preserve">                              Ishga ta’siri</w:t>
+      </w:r>
+    </w:p>
+    <w:p>
+      <w:pPr>
+        <w:pStyle w:val="Normal"/>
+        <w:spacing w:lineRule="auto" w:line="240" w:before="0" w:after="0"/>
+        <w:rPr>
+          <w:rFonts w:ascii="Times New Roman" w:hAnsi="Times New Roman" w:cs="Times New Roman"/>
+          <w:b/>
+          <w:bCs/>
+          <w:sz w:val="24"/>
+          <w:szCs w:val="24"/>
+          <w:lang w:val="en-US"/>
+        </w:rPr>
+      </w:pPr>
+      <w:r>
+        <w:rPr>
+          <w:rFonts w:cs="Times New Roman" w:ascii="Times New Roman" w:hAnsi="Times New Roman"/>
+          <w:b/>
+          <w:bCs/>
+          <w:sz w:val="24"/>
+          <w:szCs w:val="24"/>
+          <w:lang w:val="en-US"/>
+        </w:rPr>
+      </w:r>
+    </w:p>
+    <w:p>
+      <w:pPr>
+        <w:pStyle w:val="Normal"/>
+        <w:spacing w:lineRule="auto" w:line="240" w:before="0" w:after="0"/>
+        <w:rPr>
+          <w:rFonts w:ascii="Times New Roman" w:hAnsi="Times New Roman" w:cs="Times New Roman"/>
+          <w:b/>
+          <w:bCs/>
+          <w:sz w:val="24"/>
+          <w:szCs w:val="24"/>
+          <w:lang w:val="en-US"/>
+        </w:rPr>
+      </w:pPr>
+      <w:r>
+        <w:rPr>
+          <w:rFonts w:cs="Times New Roman" w:ascii="Times New Roman" w:hAnsi="Times New Roman"/>
+          <w:b/>
+          <w:bCs/>
+          <w:sz w:val="24"/>
+          <w:szCs w:val="24"/>
+          <w:lang w:val="en-US"/>
+        </w:rPr>
+      </w:r>
+    </w:p>
+    <w:p>
+      <w:pPr>
+        <w:pStyle w:val="Normal"/>
+        <w:spacing w:lineRule="auto" w:line="240" w:before="0" w:after="0"/>
+        <w:rPr>
+          <w:rFonts w:ascii="Times New Roman" w:hAnsi="Times New Roman" w:cs="Times New Roman"/>
+          <w:b/>
+          <w:bCs/>
+          <w:sz w:val="24"/>
+          <w:szCs w:val="24"/>
+          <w:lang w:val="en-US"/>
+        </w:rPr>
+      </w:pPr>
+      <w:r>
+        <w:rPr>
+          <w:rFonts w:cs="Times New Roman" w:ascii="Times New Roman" w:hAnsi="Times New Roman"/>
+          <w:b/>
+          <w:bCs/>
+          <w:sz w:val="24"/>
+          <w:szCs w:val="24"/>
+          <w:lang w:val="en-US"/>
+        </w:rPr>
+      </w:r>
+    </w:p>
+    <w:p>
+      <w:pPr>
+        <w:pStyle w:val="Normal"/>
+        <w:spacing w:lineRule="auto" w:line="240" w:before="0" w:after="0"/>
+        <w:rPr>
+          <w:rFonts w:ascii="Times New Roman" w:hAnsi="Times New Roman" w:cs="Times New Roman"/>
+          <w:b/>
+          <w:bCs/>
+          <w:sz w:val="24"/>
+          <w:szCs w:val="24"/>
+          <w:lang w:val="en-US"/>
+        </w:rPr>
+      </w:pPr>
+      <w:r>
+        <w:rPr>
+          <w:rFonts w:cs="Times New Roman" w:ascii="Times New Roman" w:hAnsi="Times New Roman"/>
+          <w:b/>
+          <w:bCs/>
+          <w:sz w:val="24"/>
+          <w:szCs w:val="24"/>
+          <w:lang w:val="en-US"/>
+        </w:rPr>
+      </w:r>
+    </w:p>
+    <w:p>
+      <w:pPr>
+        <w:pStyle w:val="Normal"/>
+        <w:spacing w:lineRule="auto" w:line="240" w:before="0" w:after="0"/>
+        <w:rPr>
+          <w:rFonts w:ascii="Times New Roman" w:hAnsi="Times New Roman" w:cs="Times New Roman"/>
+          <w:b/>
+          <w:bCs/>
+          <w:sz w:val="24"/>
+          <w:szCs w:val="24"/>
+          <w:lang w:val="en-US"/>
+        </w:rPr>
+      </w:pPr>
+      <w:r>
+        <w:rPr>
+          <w:rFonts w:cs="Times New Roman" w:ascii="Times New Roman" w:hAnsi="Times New Roman"/>
+          <w:b/>
+          <w:bCs/>
+          <w:sz w:val="24"/>
+          <w:szCs w:val="24"/>
+          <w:lang w:val="en-US"/>
+        </w:rPr>
+      </w:r>
+    </w:p>
+    <w:p>
+      <w:pPr>
+        <w:pStyle w:val="Normal"/>
+        <w:spacing w:lineRule="auto" w:line="240" w:before="0" w:after="0"/>
+        <w:rPr>
+          <w:rFonts w:ascii="Times New Roman" w:hAnsi="Times New Roman" w:cs="Times New Roman"/>
+          <w:b/>
+          <w:bCs/>
+          <w:sz w:val="24"/>
+          <w:szCs w:val="24"/>
+          <w:lang w:val="en-US"/>
+        </w:rPr>
+      </w:pPr>
+      <w:r>
+        <w:rPr>
+          <w:rFonts w:cs="Times New Roman" w:ascii="Times New Roman" w:hAnsi="Times New Roman"/>
+          <w:b/>
+          <w:bCs/>
+          <w:sz w:val="24"/>
+          <w:szCs w:val="24"/>
+          <w:lang w:val="en-US"/>
+        </w:rPr>
+      </w:r>
+    </w:p>
+    <w:p>
+      <w:pPr>
+        <w:pStyle w:val="Normal"/>
+        <w:spacing w:lineRule="auto" w:line="240" w:before="0" w:after="0"/>
+        <w:rPr>
+          <w:rFonts w:ascii="Times New Roman" w:hAnsi="Times New Roman" w:cs="Times New Roman"/>
+          <w:b/>
+          <w:bCs/>
+          <w:sz w:val="24"/>
+          <w:szCs w:val="24"/>
+          <w:lang w:val="en-US"/>
+        </w:rPr>
+      </w:pPr>
+      <w:r>
+        <w:rPr>
+          <w:rFonts w:cs="Times New Roman" w:ascii="Times New Roman" w:hAnsi="Times New Roman"/>
+          <w:b/>
+          <w:bCs/>
+          <w:sz w:val="24"/>
+          <w:szCs w:val="24"/>
+          <w:lang w:val="en-US"/>
+        </w:rPr>
+      </w:r>
+    </w:p>
+    <w:p>
+      <w:pPr>
+        <w:pStyle w:val="Normal"/>
+        <w:spacing w:lineRule="auto" w:line="240" w:before="0" w:after="0"/>
+        <w:rPr>
+          <w:rFonts w:ascii="Times New Roman" w:hAnsi="Times New Roman" w:cs="Times New Roman"/>
+          <w:b/>
+          <w:bCs/>
+          <w:sz w:val="24"/>
+          <w:szCs w:val="24"/>
+          <w:lang w:val="en-US"/>
+        </w:rPr>
+      </w:pPr>
+      <w:r>
+        <w:rPr>
+          <w:rFonts w:cs="Times New Roman" w:ascii="Times New Roman" w:hAnsi="Times New Roman"/>
+          <w:b/>
+          <w:bCs/>
+          <w:sz w:val="24"/>
+          <w:szCs w:val="24"/>
+          <w:lang w:val="en-US"/>
+        </w:rPr>
+      </w:r>
+    </w:p>
+    <w:p>
+      <w:pPr>
+        <w:pStyle w:val="Normal"/>
+        <w:spacing w:lineRule="auto" w:line="240" w:before="0" w:after="0"/>
+        <w:rPr>
+          <w:rFonts w:ascii="Times New Roman" w:hAnsi="Times New Roman" w:cs="Times New Roman"/>
+          <w:b/>
+          <w:bCs/>
+          <w:sz w:val="24"/>
+          <w:szCs w:val="24"/>
+          <w:lang w:val="en-US"/>
+        </w:rPr>
+      </w:pPr>
+      <w:r>
+        <w:rPr>
+          <w:rFonts w:cs="Times New Roman" w:ascii="Times New Roman" w:hAnsi="Times New Roman"/>
+          <w:b/>
+          <w:bCs/>
+          <w:sz w:val="24"/>
+          <w:szCs w:val="24"/>
+          <w:lang w:val="en-US"/>
+        </w:rPr>
+      </w:r>
+    </w:p>
+    <w:p>
+      <w:pPr>
+        <w:pStyle w:val="Normal"/>
+        <w:spacing w:lineRule="auto" w:line="240" w:before="0" w:after="0"/>
+        <w:rPr>
+          <w:rFonts w:ascii="Times New Roman" w:hAnsi="Times New Roman" w:cs="Times New Roman"/>
+          <w:b/>
+          <w:bCs/>
+          <w:sz w:val="24"/>
+          <w:szCs w:val="24"/>
+          <w:lang w:val="en-US"/>
+        </w:rPr>
+      </w:pPr>
+      <w:r>
+        <w:rPr>
+          <w:rFonts w:cs="Times New Roman" w:ascii="Times New Roman" w:hAnsi="Times New Roman"/>
+          <w:b/>
+          <w:bCs/>
+          <w:sz w:val="24"/>
+          <w:szCs w:val="24"/>
+          <w:lang w:val="en-US"/>
+        </w:rPr>
+      </w:r>
+    </w:p>
+    <w:p>
+      <w:pPr>
+        <w:pStyle w:val="Normal"/>
+        <w:spacing w:lineRule="auto" w:line="240" w:before="0" w:after="0"/>
+        <w:rPr>
+          <w:rFonts w:ascii="Times New Roman" w:hAnsi="Times New Roman" w:cs="Times New Roman"/>
+          <w:b/>
+          <w:bCs/>
+          <w:sz w:val="24"/>
+          <w:szCs w:val="24"/>
+          <w:lang w:val="en-US"/>
+        </w:rPr>
+      </w:pPr>
+      <w:r>
+        <w:rPr>
+          <w:rFonts w:cs="Times New Roman" w:ascii="Times New Roman" w:hAnsi="Times New Roman"/>
+          <w:b/>
+          <w:bCs/>
+          <w:sz w:val="24"/>
+          <w:szCs w:val="24"/>
+          <w:lang w:val="en-US"/>
+        </w:rPr>
+      </w:r>
+    </w:p>
+    <w:p>
+      <w:pPr>
+        <w:pStyle w:val="Normal"/>
+        <w:spacing w:lineRule="auto" w:line="240" w:before="0" w:after="0"/>
+        <w:rPr>
+          <w:rFonts w:ascii="Times New Roman" w:hAnsi="Times New Roman" w:cs="Times New Roman"/>
+          <w:b/>
+          <w:bCs/>
+          <w:sz w:val="24"/>
+          <w:szCs w:val="24"/>
+          <w:lang w:val="en-US"/>
+        </w:rPr>
+      </w:pPr>
+      <w:r>
+        <w:rPr>
+          <w:rFonts w:cs="Times New Roman" w:ascii="Times New Roman" w:hAnsi="Times New Roman"/>
+          <w:b/>
+          <w:bCs/>
+          <w:sz w:val="24"/>
+          <w:szCs w:val="24"/>
+          <w:lang w:val="en-US"/>
+        </w:rPr>
+        <w:t>Sinov/kalibrlash natijasi:__________________________________________________</w:t>
+      </w:r>
+    </w:p>
+    <w:p>
+      <w:pPr>
+        <w:pStyle w:val="Normal"/>
+        <w:rPr>
+          <w:rFonts w:ascii="Times New Roman" w:hAnsi="Times New Roman" w:cs="Times New Roman"/>
+          <w:sz w:val="24"/>
+          <w:szCs w:val="24"/>
+          <w:lang w:val="en-US"/>
+        </w:rPr>
+      </w:pPr>
+      <w:r>
+        <w:rPr>
+          <w:rFonts w:cs="Times New Roman" w:ascii="Times New Roman" w:hAnsi="Times New Roman"/>
+          <w:sz w:val="24"/>
+          <w:szCs w:val="24"/>
+          <w:lang w:val="en-US"/>
+        </w:rPr>
+        <w:t>(o‘tkazilgan bo‘lsa, me’yorlardan chetlanishlarni ko‘rsating)</w:t>
+      </w:r>
+    </w:p>
+    <w:p>
+      <w:pPr>
+        <w:pStyle w:val="Normal"/>
+        <w:rPr>
+          <w:rFonts w:ascii="Times New Roman" w:hAnsi="Times New Roman" w:cs="Times New Roman"/>
+          <w:sz w:val="24"/>
+          <w:szCs w:val="24"/>
+          <w:lang w:val="en-US"/>
+        </w:rPr>
+      </w:pPr>
+      <w:r>
+        <w:rPr>
+          <w:rFonts w:cs="Times New Roman" w:ascii="Times New Roman" w:hAnsi="Times New Roman"/>
+          <w:sz w:val="24"/>
+          <w:szCs w:val="24"/>
+          <w:lang w:val="en-US"/>
+        </w:rPr>
+      </w:r>
+    </w:p>
+    <w:p>
+      <w:pPr>
+        <w:pStyle w:val="Normal"/>
+        <w:rPr>
+          <w:rFonts w:ascii="Times New Roman" w:hAnsi="Times New Roman" w:cs="Times New Roman"/>
+          <w:b/>
+          <w:bCs/>
+          <w:sz w:val="24"/>
+          <w:szCs w:val="24"/>
+          <w:lang w:val="en-US"/>
+        </w:rPr>
+      </w:pPr>
+      <w:r>
+        <w:rPr>
+          <w:rFonts w:cs="Times New Roman" w:ascii="Times New Roman" w:hAnsi="Times New Roman"/>
+          <w:b/>
+          <w:bCs/>
+          <w:sz w:val="24"/>
+          <w:szCs w:val="24"/>
+          <w:lang w:val="en-US"/>
+        </w:rPr>
+        <w:t>5. "Xaridlar markazi" davlat muassasasi Qoraqalpog’iston Respublikasi filialining tavsiyalari:</w:t>
+      </w:r>
+    </w:p>
+    <w:tbl>
+      <w:tblPr>
+        <w:tblStyle w:val="a3"/>
+        <w:tblW w:w="9345" w:type="dxa"/>
+        <w:jc w:val="left"/>
+        <w:tblInd w:w="0" w:type="dxa"/>
+        <w:tblLayout w:type="fixed"/>
+        <w:tblCellMar>
+          <w:top w:w="0" w:type="dxa"/>
+          <w:left w:w="108" w:type="dxa"/>
+          <w:bottom w:w="0" w:type="dxa"/>
+          <w:right w:w="108" w:type="dxa"/>
+        </w:tblCellMar>
+        <w:tblLook w:val="04a0" w:noHBand="0" w:noVBand="1" w:firstColumn="1" w:lastRow="0" w:lastColumn="0" w:firstRow="1"/>
+      </w:tblPr>
+      <w:tblGrid>
+        <w:gridCol w:w="4672"/>
+        <w:gridCol w:w="4672"/>
+      </w:tblGrid>
+      <w:tr>
+        <w:trPr/>
+        <w:tc>
+          <w:tcPr>
+            <w:tcW w:w="4672" w:type="dxa"/>
+            <w:tcBorders/>
+          </w:tcPr>
+          <w:p>
+            <w:pPr>
+              <w:pStyle w:val="Normal"/>
+              <w:widowControl/>
+              <w:suppressAutoHyphens w:val="true"/>
+              <w:spacing w:lineRule="auto" w:line="240" w:before="0" w:after="0"/>
+              <w:jc w:val="left"/>
+              <w:rPr>
+                <w:rFonts w:ascii="Times New Roman" w:hAnsi="Times New Roman" w:cs="Times New Roman"/>
+                <w:sz w:val="24"/>
+                <w:szCs w:val="24"/>
+                <w:lang w:val="en-US"/>
+              </w:rPr>
+            </w:pPr>
+            <w:r>
+              <w:rPr>
+                <w:rFonts w:eastAsia="Calibri" w:cs="Times New Roman" w:ascii="Times New Roman" w:hAnsi="Times New Roman"/>
+                <w:kern w:val="0"/>
+                <w:sz w:val="24"/>
+                <w:szCs w:val="24"/>
+                <w:lang w:val="en-US" w:eastAsia="en-US" w:bidi="ar-SA"/>
+              </w:rPr>
+              <w:t xml:space="preserve">Uskuna </w:t>
+            </w:r>
+            <w:r>
+              <w:rPr>
+                <w:rFonts w:eastAsia="Calibri" w:cs="Times New Roman" w:ascii="Times New Roman" w:hAnsi="Times New Roman"/>
+                <w:b/>
+                <w:bCs/>
+                <w:kern w:val="0"/>
+                <w:sz w:val="24"/>
+                <w:szCs w:val="24"/>
+                <w:lang w:val="en-US" w:eastAsia="en-US" w:bidi="ar-SA"/>
+              </w:rPr>
+              <w:t>ta’mirlashga yaroqli / ta’mirlashga yaroqsiz</w:t>
+            </w:r>
+          </w:p>
+        </w:tc>
+        <w:tc>
+          <w:tcPr>
+            <w:tcW w:w="4672" w:type="dxa"/>
+            <w:tcBorders/>
+          </w:tcPr>
+          <w:p>
+            <w:pPr>
+              <w:pStyle w:val="Normal"/>
+              <w:widowControl/>
+              <w:suppressAutoHyphens w:val="true"/>
+              <w:spacing w:lineRule="auto" w:line="240" w:before="0" w:after="0"/>
+              <w:jc w:val="left"/>
+              <w:rPr>
+                <w:rFonts w:ascii="Times New Roman" w:hAnsi="Times New Roman" w:cs="Times New Roman"/>
+                <w:sz w:val="24"/>
+                <w:szCs w:val="24"/>
+                <w:lang w:val="en-US"/>
+              </w:rPr>
+            </w:pPr>
+            <w:r>
+              <w:rPr>
+                <w:rFonts w:eastAsia="Calibri" w:cs="Times New Roman" w:ascii="Times New Roman" w:hAnsi="Times New Roman"/>
+                <w:b/>
+                <w:bCs/>
+                <w:kern w:val="0"/>
+                <w:sz w:val="24"/>
+                <w:szCs w:val="24"/>
+                <w:lang w:val="en-US" w:eastAsia="en-US" w:bidi="ar-SA"/>
+              </w:rPr>
+              <w:t>{{ tamirlash }}</w:t>
+            </w:r>
+          </w:p>
+        </w:tc>
+      </w:tr>
+      <w:tr>
+        <w:trPr/>
+        <w:tc>
+          <w:tcPr>
+            <w:tcW w:w="4672" w:type="dxa"/>
+            <w:tcBorders/>
+          </w:tcPr>
+          <w:p>
+            <w:pPr>
+              <w:pStyle w:val="Normal"/>
+              <w:widowControl/>
+              <w:suppressAutoHyphens w:val="true"/>
+              <w:spacing w:lineRule="auto" w:line="240" w:before="0" w:after="0"/>
+              <w:jc w:val="left"/>
+              <w:rPr>
+                <w:rFonts w:ascii="Times New Roman" w:hAnsi="Times New Roman" w:cs="Times New Roman"/>
+                <w:sz w:val="24"/>
+                <w:szCs w:val="24"/>
+                <w:lang w:val="en-US"/>
+              </w:rPr>
+            </w:pPr>
+            <w:r>
+              <w:rPr>
+                <w:rFonts w:eastAsia="Calibri" w:cs="Times New Roman" w:ascii="Times New Roman" w:hAnsi="Times New Roman"/>
+                <w:b/>
+                <w:bCs/>
+                <w:kern w:val="0"/>
+                <w:sz w:val="24"/>
+                <w:szCs w:val="24"/>
+                <w:lang w:val="en-US" w:eastAsia="en-US" w:bidi="ar-SA"/>
+              </w:rPr>
+              <w:t xml:space="preserve">Metrologik tekshiruv </w:t>
+            </w:r>
+            <w:r>
+              <w:rPr>
+                <w:rFonts w:eastAsia="Calibri" w:cs="Times New Roman" w:ascii="Times New Roman" w:hAnsi="Times New Roman"/>
+                <w:kern w:val="0"/>
+                <w:sz w:val="24"/>
+                <w:szCs w:val="24"/>
+                <w:lang w:val="en-US" w:eastAsia="en-US" w:bidi="ar-SA"/>
+              </w:rPr>
+              <w:t>(dolzarbligi va qayta o‘tkazish zaruratini aniqlash)</w:t>
+            </w:r>
+          </w:p>
+        </w:tc>
+        <w:tc>
+          <w:tcPr>
+            <w:tcW w:w="4672" w:type="dxa"/>
+            <w:tcBorders/>
+          </w:tcPr>
+          <w:p>
+            <w:pPr>
+              <w:pStyle w:val="Normal"/>
+              <w:widowControl/>
+              <w:suppressAutoHyphens w:val="true"/>
+              <w:spacing w:lineRule="auto" w:line="240" w:before="0" w:after="0"/>
+              <w:jc w:val="left"/>
+              <w:rPr>
+                <w:rFonts w:ascii="Times New Roman" w:hAnsi="Times New Roman" w:cs="Times New Roman"/>
+                <w:sz w:val="24"/>
+                <w:szCs w:val="24"/>
+                <w:lang w:val="en-US"/>
+              </w:rPr>
+            </w:pPr>
+            <w:r>
+              <w:rPr>
+                <w:rFonts w:eastAsia="Calibri" w:cs="Times New Roman" w:ascii="Times New Roman" w:hAnsi="Times New Roman"/>
+                <w:kern w:val="0"/>
+                <w:sz w:val="24"/>
+                <w:szCs w:val="24"/>
+                <w:lang w:val="en-US" w:eastAsia="en-US" w:bidi="ar-SA"/>
+              </w:rPr>
+              <w:t>{{ metrologik }}</w:t>
+            </w:r>
+          </w:p>
+        </w:tc>
+      </w:tr>
+      <w:tr>
+        <w:trPr/>
+        <w:tc>
+          <w:tcPr>
+            <w:tcW w:w="4672" w:type="dxa"/>
+            <w:tcBorders/>
+          </w:tcPr>
+          <w:p>
+            <w:pPr>
+              <w:pStyle w:val="Normal"/>
+              <w:widowControl/>
+              <w:suppressAutoHyphens w:val="true"/>
+              <w:spacing w:lineRule="auto" w:line="240" w:before="0" w:after="0"/>
+              <w:jc w:val="left"/>
+              <w:rPr>
+                <w:rFonts w:ascii="Times New Roman" w:hAnsi="Times New Roman" w:cs="Times New Roman"/>
+                <w:sz w:val="24"/>
+                <w:szCs w:val="24"/>
+                <w:lang w:val="en-US"/>
+              </w:rPr>
+            </w:pPr>
+            <w:r>
+              <w:rPr>
+                <w:rFonts w:eastAsia="Calibri" w:cs="Times New Roman" w:ascii="Times New Roman" w:hAnsi="Times New Roman"/>
+                <w:kern w:val="0"/>
+                <w:sz w:val="24"/>
+                <w:szCs w:val="24"/>
+                <w:lang w:val="en-US" w:eastAsia="en-US" w:bidi="ar-SA"/>
+              </w:rPr>
+              <w:t>Tavsiya etiladigan ishlar:</w:t>
+            </w:r>
+          </w:p>
+          <w:p>
+            <w:pPr>
+              <w:pStyle w:val="Normal"/>
+              <w:widowControl/>
+              <w:suppressAutoHyphens w:val="true"/>
+              <w:spacing w:lineRule="auto" w:line="240" w:before="0" w:after="0"/>
+              <w:jc w:val="left"/>
+              <w:rPr>
+                <w:rFonts w:ascii="Times New Roman" w:hAnsi="Times New Roman" w:cs="Times New Roman"/>
+                <w:sz w:val="24"/>
+                <w:szCs w:val="24"/>
+                <w:lang w:val="en-US"/>
+              </w:rPr>
+            </w:pPr>
+            <w:r>
+              <w:rPr>
+                <w:rFonts w:eastAsia="Calibri" w:cs="Times New Roman" w:ascii="Times New Roman" w:hAnsi="Times New Roman"/>
+                <w:kern w:val="0"/>
+                <w:sz w:val="24"/>
+                <w:szCs w:val="24"/>
+                <w:lang w:val="en-US" w:eastAsia="en-US" w:bidi="ar-SA"/>
+              </w:rPr>
+              <w:t>Almashtirish va ta’mirlash uchun kerakli materiallar va ehtiyot qismlar:</w:t>
+            </w:r>
+          </w:p>
+        </w:tc>
+        <w:tc>
+          <w:tcPr>
+            <w:tcW w:w="4672" w:type="dxa"/>
+            <w:tcBorders/>
+          </w:tcPr>
+          <w:p>
+            <w:pPr>
+              <w:pStyle w:val="Normal"/>
+              <w:widowControl/>
+              <w:suppressAutoHyphens w:val="true"/>
+              <w:spacing w:lineRule="auto" w:line="240" w:before="0" w:after="0"/>
+              <w:jc w:val="left"/>
+              <w:rPr>
+                <w:rFonts w:ascii="Times New Roman" w:hAnsi="Times New Roman" w:cs="Times New Roman"/>
+                <w:sz w:val="24"/>
+                <w:szCs w:val="24"/>
+                <w:lang w:val="en-US"/>
+              </w:rPr>
+            </w:pPr>
+            <w:r>
+              <w:rPr>
+                <w:rFonts w:cs="Times New Roman" w:ascii="Times New Roman" w:hAnsi="Times New Roman"/>
+                <w:sz w:val="24"/>
+                <w:szCs w:val="24"/>
+                <w:lang w:val="en-US"/>
+              </w:rPr>
+            </w:r>
+          </w:p>
+          <w:p>
+            <w:pPr>
+              <w:pStyle w:val="Normal"/>
+              <w:widowControl/>
+              <w:suppressAutoHyphens w:val="true"/>
+              <w:spacing w:lineRule="auto" w:line="240" w:before="0" w:after="0"/>
+              <w:jc w:val="left"/>
+              <w:rPr>
+                <w:rFonts w:ascii="Times New Roman" w:hAnsi="Times New Roman" w:cs="Times New Roman"/>
+                <w:sz w:val="24"/>
+                <w:szCs w:val="24"/>
+                <w:lang w:val="en-US"/>
+              </w:rPr>
+            </w:pPr>
+            <w:r>
+              <w:rPr>
+                <w:rFonts w:cs="Times New Roman" w:ascii="Times New Roman" w:hAnsi="Times New Roman"/>
+                <w:sz w:val="24"/>
+                <w:szCs w:val="24"/>
+                <w:lang w:val="en-US"/>
+              </w:rPr>
+            </w:r>
+          </w:p>
+        </w:tc>
+      </w:tr>
+      <w:tr>
+        <w:trPr/>
+        <w:tc>
+          <w:tcPr>
+            <w:tcW w:w="4672" w:type="dxa"/>
+            <w:tcBorders/>
+          </w:tcPr>
+          <w:p>
+            <w:pPr>
+              <w:pStyle w:val="Normal"/>
+              <w:widowControl/>
+              <w:suppressAutoHyphens w:val="true"/>
+              <w:spacing w:lineRule="auto" w:line="240" w:before="0" w:after="0"/>
+              <w:jc w:val="left"/>
+              <w:rPr>
+                <w:rFonts w:ascii="Times New Roman" w:hAnsi="Times New Roman" w:cs="Times New Roman"/>
+                <w:sz w:val="24"/>
+                <w:szCs w:val="24"/>
+              </w:rPr>
+            </w:pPr>
+            <w:r>
+              <w:rPr>
+                <w:rFonts w:eastAsia="Calibri" w:cs="Times New Roman" w:ascii="Times New Roman" w:hAnsi="Times New Roman"/>
+                <w:kern w:val="0"/>
+                <w:sz w:val="24"/>
+                <w:szCs w:val="24"/>
+                <w:lang w:val="ru-RU" w:eastAsia="en-US" w:bidi="ar-SA"/>
+              </w:rPr>
+              <w:t>Ta’mirlash muddati:</w:t>
+            </w:r>
+          </w:p>
+        </w:tc>
+        <w:tc>
+          <w:tcPr>
+            <w:tcW w:w="4672" w:type="dxa"/>
+            <w:tcBorders/>
+          </w:tcPr>
+          <w:p>
+            <w:pPr>
+              <w:pStyle w:val="Normal"/>
+              <w:widowControl/>
+              <w:suppressAutoHyphens w:val="true"/>
+              <w:spacing w:lineRule="auto" w:line="240" w:before="0" w:after="0"/>
+              <w:jc w:val="left"/>
+              <w:rPr>
+                <w:rFonts w:ascii="Times New Roman" w:hAnsi="Times New Roman" w:cs="Times New Roman"/>
+                <w:sz w:val="24"/>
+                <w:szCs w:val="24"/>
+                <w:lang w:val="en-US"/>
+              </w:rPr>
+            </w:pPr>
+            <w:r>
+              <w:rPr>
+                <w:rFonts w:eastAsia="Calibri" w:cs="Times New Roman" w:ascii="Times New Roman" w:hAnsi="Times New Roman"/>
+                <w:kern w:val="0"/>
+                <w:sz w:val="24"/>
+                <w:szCs w:val="24"/>
+                <w:lang w:val="en-US" w:eastAsia="en-US" w:bidi="ar-SA"/>
+              </w:rPr>
+              <w:t>___kun</w:t>
+            </w:r>
+          </w:p>
+        </w:tc>
+      </w:tr>
+      <w:tr>
+        <w:trPr/>
+        <w:tc>
+          <w:tcPr>
+            <w:tcW w:w="4672" w:type="dxa"/>
+            <w:tcBorders/>
+          </w:tcPr>
+          <w:p>
+            <w:pPr>
+              <w:pStyle w:val="Normal"/>
+              <w:widowControl/>
+              <w:suppressAutoHyphens w:val="true"/>
+              <w:spacing w:lineRule="auto" w:line="240" w:before="0" w:after="0"/>
+              <w:jc w:val="left"/>
+              <w:rPr>
+                <w:rFonts w:ascii="Times New Roman" w:hAnsi="Times New Roman" w:cs="Times New Roman"/>
+                <w:sz w:val="24"/>
+                <w:szCs w:val="24"/>
+              </w:rPr>
+            </w:pPr>
+            <w:r>
+              <w:rPr>
+                <w:rFonts w:eastAsia="Calibri" w:cs="Times New Roman" w:ascii="Times New Roman" w:hAnsi="Times New Roman"/>
+                <w:kern w:val="0"/>
+                <w:sz w:val="24"/>
+                <w:szCs w:val="24"/>
+                <w:lang w:val="ru-RU" w:eastAsia="en-US" w:bidi="ar-SA"/>
+              </w:rPr>
+              <w:t xml:space="preserve">Foydalanishni davom ettirish imkoniyati: </w:t>
+            </w:r>
+            <w:r>
+              <w:rPr>
+                <w:rFonts w:eastAsia="Calibri" w:cs="Times New Roman" w:ascii="Times New Roman" w:hAnsi="Times New Roman"/>
+                <w:b/>
+                <w:bCs/>
+                <w:kern w:val="0"/>
+                <w:sz w:val="24"/>
+                <w:szCs w:val="24"/>
+                <w:lang w:val="ru-RU" w:eastAsia="en-US" w:bidi="ar-SA"/>
+              </w:rPr>
+              <w:t>ha /</w:t>
+            </w:r>
+            <w:r>
+              <w:rPr>
+                <w:rFonts w:eastAsia="Calibri" w:cs="Times New Roman" w:ascii="Times New Roman" w:hAnsi="Times New Roman"/>
+                <w:kern w:val="0"/>
+                <w:sz w:val="24"/>
+                <w:szCs w:val="24"/>
+                <w:lang w:val="ru-RU" w:eastAsia="en-US" w:bidi="ar-SA"/>
+              </w:rPr>
+              <w:t xml:space="preserve"> </w:t>
+            </w:r>
+            <w:r>
+              <w:rPr>
+                <w:rFonts w:eastAsia="Calibri" w:cs="Times New Roman" w:ascii="Times New Roman" w:hAnsi="Times New Roman"/>
+                <w:b/>
+                <w:bCs/>
+                <w:kern w:val="0"/>
+                <w:sz w:val="24"/>
+                <w:szCs w:val="24"/>
+                <w:lang w:val="ru-RU" w:eastAsia="en-US" w:bidi="ar-SA"/>
+              </w:rPr>
+              <w:t xml:space="preserve">yo‘q </w:t>
+            </w:r>
+            <w:r>
+              <w:rPr>
+                <w:rFonts w:eastAsia="Calibri" w:cs="Times New Roman" w:ascii="Times New Roman" w:hAnsi="Times New Roman"/>
+                <w:kern w:val="0"/>
+                <w:sz w:val="24"/>
+                <w:szCs w:val="24"/>
+                <w:lang w:val="ru-RU" w:eastAsia="en-US" w:bidi="ar-SA"/>
+              </w:rPr>
+              <w:t>(agar vaqtincha cheklovlar bilan foydalanish mumkin bo‘lsa - shartlarni ko‘rsating).</w:t>
+            </w:r>
+          </w:p>
+        </w:tc>
+        <w:tc>
+          <w:tcPr>
+            <w:tcW w:w="4672" w:type="dxa"/>
+            <w:tcBorders/>
+          </w:tcPr>
+          <w:p>
+            <w:pPr>
+              <w:pStyle w:val="Normal"/>
+              <w:widowControl/>
+              <w:suppressAutoHyphens w:val="true"/>
+              <w:spacing w:lineRule="auto" w:line="240" w:before="0" w:after="0"/>
+              <w:jc w:val="left"/>
+              <w:rPr>
+                <w:rFonts w:ascii="Times New Roman" w:hAnsi="Times New Roman" w:cs="Times New Roman"/>
+                <w:sz w:val="24"/>
+                <w:szCs w:val="24"/>
+              </w:rPr>
+            </w:pPr>
+            <w:r>
+              <w:rPr>
+                <w:rFonts w:cs="Times New Roman" w:ascii="Times New Roman" w:hAnsi="Times New Roman"/>
+                <w:sz w:val="24"/>
+                <w:szCs w:val="24"/>
+              </w:rPr>
+            </w:r>
+          </w:p>
+          <w:p>
+            <w:pPr>
+              <w:pStyle w:val="Normal"/>
+              <w:widowControl/>
+              <w:suppressAutoHyphens w:val="true"/>
+              <w:spacing w:lineRule="auto" w:line="240" w:before="0" w:after="0"/>
+              <w:jc w:val="left"/>
+              <w:rPr>
+                <w:rFonts w:ascii="Times New Roman" w:hAnsi="Times New Roman" w:cs="Times New Roman"/>
+                <w:sz w:val="24"/>
+                <w:szCs w:val="24"/>
+              </w:rPr>
+            </w:pPr>
+            <w:r>
+              <w:rPr>
+                <w:rFonts w:eastAsia="Calibri" w:cs="Times New Roman" w:ascii="Times New Roman" w:hAnsi="Times New Roman"/>
+                <w:b w:val="false"/>
+                <w:bCs w:val="false"/>
+                <w:kern w:val="0"/>
+                <w:sz w:val="24"/>
+                <w:szCs w:val="24"/>
+                <w:lang w:val="en-US" w:eastAsia="en-US" w:bidi="ar-SA"/>
+              </w:rPr>
+              <w:t>{{ foydalanish }}</w:t>
+            </w:r>
+          </w:p>
+        </w:tc>
+      </w:tr>
+    </w:tbl>
+    <w:p>
+      <w:pPr>
+        <w:pStyle w:val="Normal"/>
+        <w:rPr>
+          <w:rFonts w:ascii="Times New Roman" w:hAnsi="Times New Roman" w:cs="Times New Roman"/>
+          <w:sz w:val="24"/>
+          <w:szCs w:val="24"/>
+          <w:lang w:val="en-US"/>
+        </w:rPr>
+      </w:pPr>
+      <w:r>
+        <w:rPr>
+          <w:rFonts w:cs="Times New Roman" w:ascii="Times New Roman" w:hAnsi="Times New Roman"/>
+          <w:sz w:val="24"/>
+          <w:szCs w:val="24"/>
+          <w:lang w:val="en-US"/>
+        </w:rPr>
+      </w:r>
+    </w:p>
+    <w:p>
+      <w:pPr>
+        <w:pStyle w:val="Normal"/>
+        <w:ind w:firstLine="708"/>
+        <w:jc w:val="both"/>
+        <w:rPr>
+          <w:rFonts w:ascii="Times New Roman" w:hAnsi="Times New Roman" w:cs="Times New Roman"/>
+          <w:b/>
+          <w:bCs/>
+          <w:sz w:val="24"/>
+          <w:szCs w:val="24"/>
+          <w:lang w:val="en-US"/>
+        </w:rPr>
+      </w:pPr>
+      <w:r>
+        <w:rPr>
+          <w:rFonts w:cs="Times New Roman" w:ascii="Times New Roman" w:hAnsi="Times New Roman"/>
+          <w:sz w:val="24"/>
+          <w:szCs w:val="24"/>
+          <w:lang w:val="en-US"/>
+        </w:rPr>
+        <w:t>Yuqorida ko‘rsatilgan uskunadan foydalanishni davom ettirish to‘g‘risidagi qarorni "Xaridlar markazi" davlat muassasasining Qoraqalpog’iston Respublikasi</w:t>
+      </w:r>
+      <w:r>
+        <w:rPr>
+          <w:rFonts w:cs="Times New Roman" w:ascii="Times New Roman" w:hAnsi="Times New Roman"/>
+          <w:b/>
+          <w:bCs/>
+          <w:sz w:val="24"/>
+          <w:szCs w:val="24"/>
+          <w:lang w:val="en-US"/>
+        </w:rPr>
+        <w:t xml:space="preserve"> </w:t>
+      </w:r>
+      <w:r>
+        <w:rPr>
+          <w:rFonts w:cs="Times New Roman" w:ascii="Times New Roman" w:hAnsi="Times New Roman"/>
+          <w:sz w:val="24"/>
+          <w:szCs w:val="24"/>
+          <w:lang w:val="en-US"/>
+        </w:rPr>
+        <w:t xml:space="preserve">filiali tomonidan taqdim etilgan nuqsonlar dalolatnomasini inobatga olgan holda </w:t>
+      </w:r>
+      <w:r>
+        <w:rPr>
+          <w:rFonts w:cs="Times New Roman" w:ascii="Times New Roman" w:hAnsi="Times New Roman"/>
+          <w:b w:val="false"/>
+          <w:bCs w:val="false"/>
+          <w:color w:val="000000"/>
+          <w:sz w:val="24"/>
+          <w:szCs w:val="24"/>
+          <w:lang w:val="en-US"/>
+        </w:rPr>
+        <w:t>{{ org_address }}</w:t>
+      </w:r>
+      <w:r>
+        <w:rPr>
+          <w:rFonts w:cs="Times New Roman" w:ascii="Times New Roman" w:hAnsi="Times New Roman"/>
+          <w:b/>
+          <w:bCs/>
+          <w:sz w:val="24"/>
+          <w:szCs w:val="24"/>
+          <w:lang w:val="en-US"/>
+        </w:rPr>
+        <w:t xml:space="preserve"> </w:t>
+      </w:r>
+      <w:r>
+        <w:rPr>
+          <w:rFonts w:cs="Times New Roman" w:ascii="Times New Roman" w:hAnsi="Times New Roman"/>
+          <w:sz w:val="24"/>
+          <w:szCs w:val="24"/>
+          <w:lang w:val="en-US"/>
+        </w:rPr>
+        <w:t>mustaqil ravishda qabul qiladi.</w:t>
+      </w:r>
+    </w:p>
+    <w:p>
+      <w:pPr>
+        <w:pStyle w:val="Normal"/>
+        <w:rPr>
+          <w:rFonts w:ascii="Times New Roman" w:hAnsi="Times New Roman" w:cs="Times New Roman"/>
+          <w:b/>
+          <w:bCs/>
+          <w:sz w:val="24"/>
+          <w:szCs w:val="24"/>
+          <w:lang w:val="en-US"/>
+        </w:rPr>
+      </w:pPr>
+      <w:r>
+        <w:rPr>
+          <w:rFonts w:cs="Times New Roman" w:ascii="Times New Roman" w:hAnsi="Times New Roman"/>
+          <w:b/>
+          <w:bCs/>
+          <w:sz w:val="24"/>
+          <w:szCs w:val="24"/>
+          <w:lang w:val="en-US"/>
+        </w:rPr>
+        <w:t>6. Tomonlarning imzolari:</w:t>
+      </w:r>
+    </w:p>
+    <w:p>
+      <w:pPr>
+        <w:pStyle w:val="Normal"/>
+        <w:rPr>
+          <w:b/>
+          <w:bCs/>
+        </w:rPr>
+      </w:pPr>
+      <w:r>
+        <w:rPr>
+          <w:rFonts w:cs="Times New Roman" w:ascii="Times New Roman" w:hAnsi="Times New Roman"/>
+          <w:b/>
+          <w:bCs/>
+          <w:color w:val="000000"/>
+          <w:sz w:val="24"/>
+          <w:szCs w:val="24"/>
+          <w:lang w:val="en-US"/>
+        </w:rPr>
+        <w:t>{{ org_address }}</w:t>
+      </w:r>
+      <w:r>
+        <w:rPr>
+          <w:rFonts w:cs="Times New Roman" w:ascii="Times New Roman" w:hAnsi="Times New Roman"/>
+          <w:b/>
+          <w:bCs/>
+          <w:sz w:val="24"/>
+          <w:szCs w:val="24"/>
+          <w:lang w:val="en-US"/>
+        </w:rPr>
+        <w:t>:</w:t>
+      </w:r>
+    </w:p>
+    <w:p>
+      <w:pPr>
+        <w:pStyle w:val="Normal"/>
+        <w:rPr>
+          <w:rFonts w:ascii="Times New Roman" w:hAnsi="Times New Roman" w:cs="Times New Roman"/>
+          <w:sz w:val="24"/>
+          <w:szCs w:val="24"/>
+          <w:lang w:val="en-US"/>
+        </w:rPr>
+      </w:pPr>
+      <w:r>
+        <w:rPr>
+          <w:rFonts w:cs="Times New Roman" w:ascii="Times New Roman" w:hAnsi="Times New Roman"/>
+          <w:sz w:val="24"/>
+          <w:szCs w:val="24"/>
+          <w:lang w:val="en-US"/>
+        </w:rPr>
+        <w:t xml:space="preserve">Bosh shifokor:  </w:t>
+      </w:r>
+      <w:r>
+        <w:rPr>
+          <w:rFonts w:cs="Times New Roman" w:ascii="Times New Roman" w:hAnsi="Times New Roman"/>
+          <w:b w:val="false"/>
+          <w:bCs w:val="false"/>
+          <w:color w:val="000000"/>
+          <w:sz w:val="24"/>
+          <w:szCs w:val="24"/>
+          <w:lang w:val="en-US"/>
+        </w:rPr>
+        <w:t>{{ org_head }}</w:t>
+      </w:r>
+    </w:p>
+    <w:p>
+      <w:pPr>
+        <w:pStyle w:val="Normal"/>
+        <w:rPr>
+          <w:rFonts w:ascii="Times New Roman" w:hAnsi="Times New Roman" w:cs="Times New Roman"/>
+          <w:sz w:val="24"/>
+          <w:szCs w:val="24"/>
+          <w:lang w:val="en-US"/>
+        </w:rPr>
+      </w:pPr>
+      <w:r>
+        <w:rPr>
+          <w:rFonts w:cs="Times New Roman" w:ascii="Times New Roman" w:hAnsi="Times New Roman"/>
+          <w:sz w:val="24"/>
+          <w:szCs w:val="24"/>
+          <w:lang w:val="en-US"/>
+        </w:rPr>
+        <w:t xml:space="preserve">   </w:t>
+      </w:r>
+      <w:r>
+        <w:rPr>
+          <w:rFonts w:cs="Times New Roman" w:ascii="Times New Roman" w:hAnsi="Times New Roman"/>
+          <w:sz w:val="24"/>
+          <w:szCs w:val="24"/>
+          <w:lang w:val="en-US"/>
+        </w:rPr>
+        <w:t>________ (F.I.O., lavozimi) /  Imzo</w:t>
+      </w:r>
+    </w:p>
+    <w:p>
+      <w:pPr>
+        <w:pStyle w:val="Normal"/>
+        <w:rPr>
+          <w:rFonts w:ascii="Times New Roman" w:hAnsi="Times New Roman" w:cs="Times New Roman"/>
+          <w:b/>
+          <w:bCs/>
+          <w:sz w:val="24"/>
+          <w:szCs w:val="24"/>
+          <w:lang w:val="en-US"/>
+        </w:rPr>
+      </w:pPr>
+      <w:r>
+        <w:rPr>
+          <w:rFonts w:cs="Times New Roman" w:ascii="Times New Roman" w:hAnsi="Times New Roman"/>
+          <w:b/>
+          <w:bCs/>
+          <w:sz w:val="24"/>
+          <w:szCs w:val="24"/>
+          <w:lang w:val="en-US"/>
+        </w:rPr>
+      </w:r>
+    </w:p>
+    <w:p>
+      <w:pPr>
+        <w:pStyle w:val="Normal"/>
+        <w:rPr>
+          <w:rFonts w:ascii="Times New Roman" w:hAnsi="Times New Roman" w:cs="Times New Roman"/>
+          <w:b/>
+          <w:bCs/>
+          <w:sz w:val="24"/>
+          <w:szCs w:val="24"/>
+          <w:lang w:val="en-US"/>
+        </w:rPr>
+      </w:pPr>
+      <w:r>
+        <w:rPr>
+          <w:rFonts w:cs="Times New Roman" w:ascii="Times New Roman" w:hAnsi="Times New Roman"/>
+          <w:b/>
+          <w:bCs/>
+          <w:sz w:val="24"/>
+          <w:szCs w:val="24"/>
+          <w:lang w:val="en-US"/>
+        </w:rPr>
+        <w:t>"Xaridlar markazi" DM Qoraqalpog’iston Respublikasi filialidan:</w:t>
+      </w:r>
+    </w:p>
+    <w:p>
+      <w:pPr>
+        <w:pStyle w:val="Normal"/>
+        <w:rPr>
+          <w:rFonts w:ascii="Times New Roman" w:hAnsi="Times New Roman" w:cs="Times New Roman"/>
+          <w:sz w:val="24"/>
+          <w:szCs w:val="24"/>
+          <w:lang w:val="en-US"/>
+        </w:rPr>
+      </w:pPr>
+      <w:r>
+        <w:rPr>
+          <w:rFonts w:cs="Times New Roman" w:ascii="Times New Roman" w:hAnsi="Times New Roman"/>
+          <w:sz w:val="24"/>
+          <w:szCs w:val="24"/>
+          <w:lang w:val="en-US"/>
+        </w:rPr>
+        <w:t>Rahbar: Soy S.V.</w:t>
+      </w:r>
+    </w:p>
+    <w:p>
+      <w:pPr>
+        <w:pStyle w:val="Normal"/>
+        <w:rPr>
+          <w:rFonts w:ascii="Times New Roman" w:hAnsi="Times New Roman" w:cs="Times New Roman"/>
+          <w:sz w:val="24"/>
+          <w:szCs w:val="24"/>
+          <w:lang w:val="en-US"/>
+        </w:rPr>
+      </w:pPr>
+      <w:r>
+        <w:rPr>
+          <w:rFonts w:cs="Times New Roman" w:ascii="Times New Roman" w:hAnsi="Times New Roman"/>
+          <w:sz w:val="24"/>
+          <w:szCs w:val="24"/>
+          <w:lang w:val="en-US"/>
+        </w:rPr>
+        <w:t>________ (F.I.O., lavozimi) / Muhr va imzo</w:t>
+      </w:r>
+    </w:p>
+    <w:p>
+      <w:pPr>
+        <w:pStyle w:val="Normal"/>
+        <w:rPr>
+          <w:rFonts w:ascii="Times New Roman" w:hAnsi="Times New Roman" w:cs="Times New Roman"/>
+          <w:sz w:val="24"/>
+          <w:szCs w:val="24"/>
+          <w:lang w:val="en-US"/>
+        </w:rPr>
+      </w:pPr>
+      <w:r>
+        <w:rPr>
+          <w:rFonts w:cs="Times New Roman" w:ascii="Times New Roman" w:hAnsi="Times New Roman"/>
+          <w:sz w:val="24"/>
+          <w:szCs w:val="24"/>
+          <w:lang w:val="en-US"/>
+        </w:rPr>
+      </w:r>
+    </w:p>
+    <w:p>
+      <w:pPr>
+        <w:pStyle w:val="Normal"/>
+        <w:rPr>
+          <w:rFonts w:ascii="Times New Roman" w:hAnsi="Times New Roman" w:cs="Times New Roman"/>
+          <w:b/>
+          <w:bCs/>
+          <w:sz w:val="24"/>
+          <w:szCs w:val="24"/>
+          <w:lang w:val="en-US"/>
+        </w:rPr>
+      </w:pPr>
+      <w:r>
+        <w:rPr>
+          <w:rFonts w:cs="Times New Roman" w:ascii="Times New Roman" w:hAnsi="Times New Roman"/>
+          <w:b/>
+          <w:bCs/>
+          <w:sz w:val="24"/>
+          <w:szCs w:val="24"/>
+          <w:lang w:val="en-US"/>
+        </w:rPr>
+        <w:t>Ilovalar:</w:t>
+      </w:r>
+    </w:p>
+    <w:p>
+      <w:pPr>
+        <w:pStyle w:val="Normal"/>
+        <w:rPr>
+          <w:rFonts w:ascii="Times New Roman" w:hAnsi="Times New Roman" w:cs="Times New Roman"/>
+          <w:sz w:val="24"/>
+          <w:szCs w:val="24"/>
+          <w:lang w:val="en-US"/>
+        </w:rPr>
+      </w:pPr>
+      <w:r>
+        <w:rPr>
+          <w:rFonts w:cs="Times New Roman" w:ascii="Times New Roman" w:hAnsi="Times New Roman"/>
+          <w:sz w:val="24"/>
+          <w:szCs w:val="24"/>
+          <w:lang w:val="en-US"/>
+        </w:rPr>
+        <w:t xml:space="preserve">• </w:t>
+      </w:r>
+      <w:r>
+        <w:rPr>
+          <w:rFonts w:cs="Times New Roman" w:ascii="Times New Roman" w:hAnsi="Times New Roman"/>
+          <w:sz w:val="24"/>
+          <w:szCs w:val="24"/>
+          <w:lang w:val="en-US"/>
+        </w:rPr>
+        <w:t>Diagnostika akti (agar mavjud bo‘lsa).</w:t>
+      </w:r>
+    </w:p>
+    <w:p>
+      <w:pPr>
+        <w:pStyle w:val="Normal"/>
+        <w:rPr>
+          <w:rFonts w:ascii="Times New Roman" w:hAnsi="Times New Roman" w:cs="Times New Roman"/>
+          <w:sz w:val="24"/>
+          <w:szCs w:val="24"/>
+          <w:lang w:val="en-US"/>
+        </w:rPr>
+      </w:pPr>
+      <w:r>
+        <w:rPr>
+          <w:rFonts w:cs="Times New Roman" w:ascii="Times New Roman" w:hAnsi="Times New Roman"/>
+          <w:sz w:val="24"/>
+          <w:szCs w:val="24"/>
+          <w:lang w:val="en-US"/>
+        </w:rPr>
+        <w:t xml:space="preserve">• </w:t>
+      </w:r>
+      <w:r>
+        <w:rPr>
+          <w:rFonts w:cs="Times New Roman" w:ascii="Times New Roman" w:hAnsi="Times New Roman"/>
+          <w:sz w:val="24"/>
+          <w:szCs w:val="24"/>
+          <w:lang w:val="en-US"/>
+        </w:rPr>
+        <w:t>Xatolarni chop etish (log-fayllar, xato kodlari).</w:t>
+      </w:r>
+    </w:p>
+    <w:p>
+      <w:pPr>
+        <w:pStyle w:val="Normal"/>
+        <w:rPr>
+          <w:rFonts w:ascii="Times New Roman" w:hAnsi="Times New Roman" w:cs="Times New Roman"/>
+          <w:sz w:val="24"/>
+          <w:szCs w:val="24"/>
+          <w:lang w:val="en-US"/>
+        </w:rPr>
+      </w:pPr>
+      <w:r>
+        <w:rPr>
+          <w:rFonts w:cs="Times New Roman" w:ascii="Times New Roman" w:hAnsi="Times New Roman"/>
+          <w:sz w:val="24"/>
+          <w:szCs w:val="24"/>
+          <w:lang w:val="en-US"/>
+        </w:rPr>
+        <w:t xml:space="preserve">• </w:t>
+      </w:r>
+      <w:r>
+        <w:rPr>
+          <w:rFonts w:cs="Times New Roman" w:ascii="Times New Roman" w:hAnsi="Times New Roman"/>
+          <w:sz w:val="24"/>
+          <w:szCs w:val="24"/>
+          <w:lang w:val="en-US"/>
+        </w:rPr>
+        <w:t>Nuqsonlar surati (zarur bo‘lganda).</w:t>
+      </w:r>
+    </w:p>
+    <w:p>
+      <w:pPr>
+        <w:pStyle w:val="Normal"/>
+        <w:spacing w:before="0" w:after="160"/>
+        <w:rPr>
+          <w:rFonts w:ascii="Times New Roman" w:hAnsi="Times New Roman" w:cs="Times New Roman"/>
+          <w:sz w:val="24"/>
+          <w:szCs w:val="24"/>
+        </w:rPr>
+      </w:pPr>
+      <w:r>
+        <w:rPr>
+          <w:rFonts w:cs="Times New Roman" w:ascii="Times New Roman" w:hAnsi="Times New Roman"/>
+          <w:b/>
+          <w:bCs/>
+          <w:color w:val="000000"/>
+          <w:sz w:val="24"/>
+          <w:szCs w:val="24"/>
+        </w:rPr>
+        <w:t>________________________________________</w:t>
+      </w:r>
+    </w:p>
+    <w:p>
+      <w:pPr>
+        <w:pStyle w:val="Normal"/>
+        <w:spacing w:before="0" w:after="160"/>
+        <w:rPr>
+          <w:rFonts w:ascii="Times New Roman" w:hAnsi="Times New Roman" w:cs="Times New Roman"/>
+          <w:b/>
+          <w:bCs/>
+          <w:sz w:val="24"/>
+          <w:szCs w:val="24"/>
+        </w:rPr>
+      </w:pPr>
+      <w:r>
+        <w:rPr>
+          <w:rFonts w:cs="Times New Roman" w:ascii="Times New Roman" w:hAnsi="Times New Roman"/>
+          <w:b/>
+          <w:bCs/>
+          <w:sz w:val="24"/>
+          <w:szCs w:val="24"/>
+        </w:rPr>
+        <w:t>{% endif %}</w:t>
+      </w:r>
+    </w:p>
+    <w:p>
+      <w:pPr>
+        <w:pStyle w:val="Normal"/>
+        <w:spacing w:before="0" w:after="160"/>
+        <w:rPr>
+          <w:rFonts w:ascii="Times New Roman" w:hAnsi="Times New Roman" w:cs="Times New Roman"/>
+          <w:sz w:val="24"/>
+          <w:szCs w:val="24"/>
+        </w:rPr>
+      </w:pPr>
+      <w:r>
+        <w:rPr>
+          <w:rFonts w:cs="Times New Roman" w:ascii="Times New Roman" w:hAnsi="Times New Roman"/>
+          <w:sz w:val="24"/>
+          <w:szCs w:val="24"/>
+        </w:rPr>
+      </w:r>
+    </w:p>
+    <w:p>
+      <w:pPr>
+        <w:pStyle w:val="Normal"/>
+        <w:spacing w:before="0" w:after="160"/>
+        <w:rPr>
+          <w:rFonts w:ascii="Times New Roman" w:hAnsi="Times New Roman" w:cs="Times New Roman"/>
+          <w:sz w:val="24"/>
+          <w:szCs w:val="24"/>
+        </w:rPr>
+      </w:pPr>
+      <w:r>
+        <w:rPr>
+          <w:rFonts w:cs="Times New Roman" w:ascii="Times New Roman" w:hAnsi="Times New Roman"/>
+          <w:sz w:val="24"/>
+          <w:szCs w:val="24"/>
+        </w:rPr>
       </w:r>
     </w:p>
     <w:sectPr>
@@ -2061,6 +4622,282 @@
     </w:r>
   </w:p>
 </w:hdr>
+</file>
+
+<file path=word/numbering.xml><?xml version="1.0" encoding="utf-8"?>
+<w:numbering xmlns:w="http://schemas.openxmlformats.org/wordprocessingml/2006/main" xmlns:o="urn:schemas-microsoft-com:office:office" xmlns:r="http://schemas.openxmlformats.org/officeDocument/2006/relationships" xmlns:v="urn:schemas-microsoft-com:vml" xmlns:mc="http://schemas.openxmlformats.org/markup-compatibility/2006" xmlns:w14="http://schemas.microsoft.com/office/word/2010/wordml" mc:Ignorable="w14">
+  <w:abstractNum w:abstractNumId="1">
+    <w:lvl w:ilvl="0">
+      <w:start w:val="1"/>
+      <w:numFmt w:val="bullet"/>
+      <w:lvlText w:val=""/>
+      <w:lvlJc w:val="left"/>
+      <w:pPr>
+        <w:tabs>
+          <w:tab w:val="num" w:pos="720"/>
+        </w:tabs>
+        <w:ind w:left="720" w:hanging="360"/>
+      </w:pPr>
+      <w:rPr>
+        <w:rFonts w:ascii="Symbol" w:hAnsi="Symbol" w:cs="Symbol" w:hint="default"/>
+        <w:sz w:val="20"/>
+      </w:rPr>
+    </w:lvl>
+    <w:lvl w:ilvl="1">
+      <w:start w:val="1"/>
+      <w:numFmt w:val="bullet"/>
+      <w:lvlText w:val="o"/>
+      <w:lvlJc w:val="left"/>
+      <w:pPr>
+        <w:tabs>
+          <w:tab w:val="num" w:pos="1440"/>
+        </w:tabs>
+        <w:ind w:left="1440" w:hanging="360"/>
+      </w:pPr>
+      <w:rPr>
+        <w:rFonts w:ascii="Courier New" w:hAnsi="Courier New" w:cs="Courier New" w:hint="default"/>
+        <w:sz w:val="20"/>
+      </w:rPr>
+    </w:lvl>
+    <w:lvl w:ilvl="2">
+      <w:start w:val="1"/>
+      <w:numFmt w:val="bullet"/>
+      <w:lvlText w:val=""/>
+      <w:lvlJc w:val="left"/>
+      <w:pPr>
+        <w:tabs>
+          <w:tab w:val="num" w:pos="2160"/>
+        </w:tabs>
+        <w:ind w:left="2160" w:hanging="360"/>
+      </w:pPr>
+      <w:rPr>
+        <w:rFonts w:ascii="Wingdings" w:hAnsi="Wingdings" w:cs="Wingdings" w:hint="default"/>
+        <w:sz w:val="20"/>
+      </w:rPr>
+    </w:lvl>
+    <w:lvl w:ilvl="3">
+      <w:start w:val="1"/>
+      <w:numFmt w:val="bullet"/>
+      <w:lvlText w:val=""/>
+      <w:lvlJc w:val="left"/>
+      <w:pPr>
+        <w:tabs>
+          <w:tab w:val="num" w:pos="2880"/>
+        </w:tabs>
+        <w:ind w:left="2880" w:hanging="360"/>
+      </w:pPr>
+      <w:rPr>
+        <w:rFonts w:ascii="Wingdings" w:hAnsi="Wingdings" w:cs="Wingdings" w:hint="default"/>
+        <w:sz w:val="20"/>
+      </w:rPr>
+    </w:lvl>
+    <w:lvl w:ilvl="4">
+      <w:start w:val="1"/>
+      <w:numFmt w:val="bullet"/>
+      <w:lvlText w:val=""/>
+      <w:lvlJc w:val="left"/>
+      <w:pPr>
+        <w:tabs>
+          <w:tab w:val="num" w:pos="3600"/>
+        </w:tabs>
+        <w:ind w:left="3600" w:hanging="360"/>
+      </w:pPr>
+      <w:rPr>
+        <w:rFonts w:ascii="Wingdings" w:hAnsi="Wingdings" w:cs="Wingdings" w:hint="default"/>
+        <w:sz w:val="20"/>
+      </w:rPr>
+    </w:lvl>
+    <w:lvl w:ilvl="5">
+      <w:start w:val="1"/>
+      <w:numFmt w:val="bullet"/>
+      <w:lvlText w:val=""/>
+      <w:lvlJc w:val="left"/>
+      <w:pPr>
+        <w:tabs>
+          <w:tab w:val="num" w:pos="4320"/>
+        </w:tabs>
+        <w:ind w:left="4320" w:hanging="360"/>
+      </w:pPr>
+      <w:rPr>
+        <w:rFonts w:ascii="Wingdings" w:hAnsi="Wingdings" w:cs="Wingdings" w:hint="default"/>
+        <w:sz w:val="20"/>
+      </w:rPr>
+    </w:lvl>
+    <w:lvl w:ilvl="6">
+      <w:start w:val="1"/>
+      <w:numFmt w:val="bullet"/>
+      <w:lvlText w:val=""/>
+      <w:lvlJc w:val="left"/>
+      <w:pPr>
+        <w:tabs>
+          <w:tab w:val="num" w:pos="5040"/>
+        </w:tabs>
+        <w:ind w:left="5040" w:hanging="360"/>
+      </w:pPr>
+      <w:rPr>
+        <w:rFonts w:ascii="Wingdings" w:hAnsi="Wingdings" w:cs="Wingdings" w:hint="default"/>
+        <w:sz w:val="20"/>
+      </w:rPr>
+    </w:lvl>
+    <w:lvl w:ilvl="7">
+      <w:start w:val="1"/>
+      <w:numFmt w:val="bullet"/>
+      <w:lvlText w:val=""/>
+      <w:lvlJc w:val="left"/>
+      <w:pPr>
+        <w:tabs>
+          <w:tab w:val="num" w:pos="5760"/>
+        </w:tabs>
+        <w:ind w:left="5760" w:hanging="360"/>
+      </w:pPr>
+      <w:rPr>
+        <w:rFonts w:ascii="Wingdings" w:hAnsi="Wingdings" w:cs="Wingdings" w:hint="default"/>
+        <w:sz w:val="20"/>
+      </w:rPr>
+    </w:lvl>
+    <w:lvl w:ilvl="8">
+      <w:start w:val="1"/>
+      <w:numFmt w:val="bullet"/>
+      <w:lvlText w:val=""/>
+      <w:lvlJc w:val="left"/>
+      <w:pPr>
+        <w:tabs>
+          <w:tab w:val="num" w:pos="6480"/>
+        </w:tabs>
+        <w:ind w:left="6480" w:hanging="360"/>
+      </w:pPr>
+      <w:rPr>
+        <w:rFonts w:ascii="Wingdings" w:hAnsi="Wingdings" w:cs="Wingdings" w:hint="default"/>
+        <w:sz w:val="20"/>
+      </w:rPr>
+    </w:lvl>
+  </w:abstractNum>
+  <w:abstractNum w:abstractNumId="2">
+    <w:lvl w:ilvl="0">
+      <w:start w:val="1"/>
+      <w:numFmt w:val="none"/>
+      <w:suff w:val="nothing"/>
+      <w:lvlText w:val=""/>
+      <w:lvlJc w:val="left"/>
+      <w:pPr>
+        <w:tabs>
+          <w:tab w:val="num" w:pos="0"/>
+        </w:tabs>
+        <w:ind w:left="0" w:hanging="0"/>
+      </w:pPr>
+    </w:lvl>
+    <w:lvl w:ilvl="1">
+      <w:start w:val="1"/>
+      <w:numFmt w:val="none"/>
+      <w:suff w:val="nothing"/>
+      <w:lvlText w:val=""/>
+      <w:lvlJc w:val="left"/>
+      <w:pPr>
+        <w:tabs>
+          <w:tab w:val="num" w:pos="0"/>
+        </w:tabs>
+        <w:ind w:left="0" w:hanging="0"/>
+      </w:pPr>
+    </w:lvl>
+    <w:lvl w:ilvl="2">
+      <w:start w:val="1"/>
+      <w:numFmt w:val="none"/>
+      <w:suff w:val="nothing"/>
+      <w:lvlText w:val=""/>
+      <w:lvlJc w:val="left"/>
+      <w:pPr>
+        <w:tabs>
+          <w:tab w:val="num" w:pos="0"/>
+        </w:tabs>
+        <w:ind w:left="0" w:hanging="0"/>
+      </w:pPr>
+    </w:lvl>
+    <w:lvl w:ilvl="3">
+      <w:start w:val="1"/>
+      <w:numFmt w:val="none"/>
+      <w:suff w:val="nothing"/>
+      <w:lvlText w:val=""/>
+      <w:lvlJc w:val="left"/>
+      <w:pPr>
+        <w:tabs>
+          <w:tab w:val="num" w:pos="0"/>
+        </w:tabs>
+        <w:ind w:left="0" w:hanging="0"/>
+      </w:pPr>
+    </w:lvl>
+    <w:lvl w:ilvl="4">
+      <w:start w:val="1"/>
+      <w:numFmt w:val="none"/>
+      <w:suff w:val="nothing"/>
+      <w:lvlText w:val=""/>
+      <w:lvlJc w:val="left"/>
+      <w:pPr>
+        <w:tabs>
+          <w:tab w:val="num" w:pos="0"/>
+        </w:tabs>
+        <w:ind w:left="0" w:hanging="0"/>
+      </w:pPr>
+    </w:lvl>
+    <w:lvl w:ilvl="5">
+      <w:start w:val="1"/>
+      <w:numFmt w:val="none"/>
+      <w:suff w:val="nothing"/>
+      <w:lvlText w:val=""/>
+      <w:lvlJc w:val="left"/>
+      <w:pPr>
+        <w:tabs>
+          <w:tab w:val="num" w:pos="0"/>
+        </w:tabs>
+        <w:ind w:left="0" w:hanging="0"/>
+      </w:pPr>
+    </w:lvl>
+    <w:lvl w:ilvl="6">
+      <w:start w:val="1"/>
+      <w:numFmt w:val="none"/>
+      <w:suff w:val="nothing"/>
+      <w:lvlText w:val=""/>
+      <w:lvlJc w:val="left"/>
+      <w:pPr>
+        <w:tabs>
+          <w:tab w:val="num" w:pos="0"/>
+        </w:tabs>
+        <w:ind w:left="0" w:hanging="0"/>
+      </w:pPr>
+    </w:lvl>
+    <w:lvl w:ilvl="7">
+      <w:start w:val="1"/>
+      <w:numFmt w:val="none"/>
+      <w:suff w:val="nothing"/>
+      <w:lvlText w:val=""/>
+      <w:lvlJc w:val="left"/>
+      <w:pPr>
+        <w:tabs>
+          <w:tab w:val="num" w:pos="0"/>
+        </w:tabs>
+        <w:ind w:left="0" w:hanging="0"/>
+      </w:pPr>
+    </w:lvl>
+    <w:lvl w:ilvl="8">
+      <w:start w:val="1"/>
+      <w:numFmt w:val="none"/>
+      <w:suff w:val="nothing"/>
+      <w:lvlText w:val=""/>
+      <w:lvlJc w:val="left"/>
+      <w:pPr>
+        <w:tabs>
+          <w:tab w:val="num" w:pos="0"/>
+        </w:tabs>
+        <w:ind w:left="0" w:hanging="0"/>
+      </w:pPr>
+    </w:lvl>
+  </w:abstractNum>
+  <w:num w:numId="1">
+    <w:abstractNumId w:val="1"/>
+  </w:num>
+  <w:num w:numId="2">
+    <w:abstractNumId w:val="2"/>
+  </w:num>
+</w:numbering>
 </file>
 
 <file path=word/styles.xml><?xml version="1.0" encoding="utf-8"?>
@@ -2634,6 +5471,39 @@
       <w:bCs/>
     </w:rPr>
   </w:style>
+  <w:style w:type="paragraph" w:styleId="HTMLPreformatted">
+    <w:name w:val="HTML Preformatted"/>
+    <w:basedOn w:val="Normal"/>
+    <w:qFormat/>
+    <w:pPr>
+      <w:tabs>
+        <w:tab w:val="clear" w:pos="708"/>
+        <w:tab w:val="left" w:pos="916" w:leader="none"/>
+        <w:tab w:val="left" w:pos="1832" w:leader="none"/>
+        <w:tab w:val="left" w:pos="2748" w:leader="none"/>
+        <w:tab w:val="left" w:pos="3664" w:leader="none"/>
+        <w:tab w:val="left" w:pos="4580" w:leader="none"/>
+        <w:tab w:val="left" w:pos="5496" w:leader="none"/>
+        <w:tab w:val="left" w:pos="6412" w:leader="none"/>
+        <w:tab w:val="left" w:pos="7328" w:leader="none"/>
+        <w:tab w:val="left" w:pos="8244" w:leader="none"/>
+        <w:tab w:val="left" w:pos="9160" w:leader="none"/>
+        <w:tab w:val="left" w:pos="10076" w:leader="none"/>
+        <w:tab w:val="left" w:pos="10992" w:leader="none"/>
+        <w:tab w:val="left" w:pos="11908" w:leader="none"/>
+        <w:tab w:val="left" w:pos="12824" w:leader="none"/>
+        <w:tab w:val="left" w:pos="13740" w:leader="none"/>
+        <w:tab w:val="left" w:pos="14656" w:leader="none"/>
+      </w:tabs>
+      <w:spacing w:lineRule="auto" w:line="240" w:before="0" w:after="0"/>
+    </w:pPr>
+    <w:rPr>
+      <w:rFonts w:ascii="Courier New" w:hAnsi="Courier New" w:eastAsia="Times New Roman" w:cs="Courier New"/>
+      <w:sz w:val="20"/>
+      <w:szCs w:val="20"/>
+      <w:lang w:eastAsia="ru-RU"/>
+    </w:rPr>
+  </w:style>
   <w:style w:type="numbering" w:styleId="NoList" w:default="1">
     <w:name w:val="No List"/>
     <w:uiPriority w:val="99"/>

</xml_diff>